<commit_message>
260708 18:01 서서울 최프 발표자료, war file
</commit_message>
<xml_diff>
--- a/0.산출물/7. 최종보고서/[웹보안] 취약점 진단 용역_최종_보고서 v0.02.docx
+++ b/0.산출물/7. 최종보고서/[웹보안] 취약점 진단 용역_최종_보고서 v0.02.docx
@@ -1,6 +1,6 @@
 
 <file path=word/document.xml><?xml version="1.0" encoding="utf-8"?>
-<w:document xmlns:wpc="http://schemas.microsoft.com/office/word/2010/wordprocessingCanvas" xmlns:cx="http://schemas.microsoft.com/office/drawing/2014/chartex" xmlns:cx1="http://schemas.microsoft.com/office/drawing/2015/9/8/chartex" xmlns:cx2="http://schemas.microsoft.com/office/drawing/2015/10/21/chartex" xmlns:cx3="http://schemas.microsoft.com/office/drawing/2016/5/9/chartex" xmlns:cx4="http://schemas.microsoft.com/office/drawing/2016/5/10/chartex" xmlns:cx5="http://schemas.microsoft.com/office/drawing/2016/5/11/chartex" xmlns:cx6="http://schemas.microsoft.com/office/drawing/2016/5/12/chartex" xmlns:cx7="http://schemas.microsoft.com/office/drawing/2016/5/13/chartex" xmlns:cx8="http://schemas.microsoft.com/office/drawing/2016/5/14/chartex" xmlns:mc="http://schemas.openxmlformats.org/markup-compatibility/2006" xmlns:aink="http://schemas.microsoft.com/office/drawing/2016/ink" xmlns:am3d="http://schemas.microsoft.com/office/drawing/2017/model3d" xmlns:o="urn:schemas-microsoft-com:office:office" xmlns:oel="http://schemas.microsoft.com/office/2019/extlst" xmlns:r="http://schemas.openxmlformats.org/officeDocument/2006/relationships" xmlns:m="http://schemas.openxmlformats.org/officeDocument/2006/math" xmlns:v="urn:schemas-microsoft-com:vml" xmlns:wp14="http://schemas.microsoft.com/office/word/2010/wordprocessingDrawing" xmlns:wp="http://schemas.openxmlformats.org/drawingml/2006/wordprocessingDrawing" xmlns:w10="urn:schemas-microsoft-com:office:word" xmlns:w="http://schemas.openxmlformats.org/wordprocessingml/2006/main" xmlns:w14="http://schemas.microsoft.com/office/word/2010/wordml" xmlns:w15="http://schemas.microsoft.com/office/word/2012/wordml" xmlns:w16cex="http://schemas.microsoft.com/office/word/2018/wordml/cex" xmlns:w16cid="http://schemas.microsoft.com/office/word/2016/wordml/cid" xmlns:w16="http://schemas.microsoft.com/office/word/2018/wordml" xmlns:w16du="http://schemas.microsoft.com/office/word/2023/wordml/word16du" xmlns:w16sdtdh="http://schemas.microsoft.com/office/word/2020/wordml/sdtdatahash" xmlns:w16sdtfl="http://schemas.microsoft.com/office/word/2024/wordml/sdtformatlock" xmlns:w16se="http://schemas.microsoft.com/office/word/2015/wordml/symex" xmlns:wpg="http://schemas.microsoft.com/office/word/2010/wordprocessingGroup" xmlns:wpi="http://schemas.microsoft.com/office/word/2010/wordprocessingInk" xmlns:wne="http://schemas.microsoft.com/office/word/2006/wordml" xmlns:wps="http://schemas.microsoft.com/office/word/2010/wordprocessingShape" mc:Ignorable="w14 w15 w16se w16cid w16 w16cex w16sdtdh w16sdtfl w16du wp14">
+<w:document xmlns:wpc="http://schemas.microsoft.com/office/word/2010/wordprocessingCanvas" xmlns:cx="http://schemas.microsoft.com/office/drawing/2014/chartex" xmlns:mc="http://schemas.openxmlformats.org/markup-compatibility/2006" xmlns:o="urn:schemas-microsoft-com:office:office" xmlns:r="http://schemas.openxmlformats.org/officeDocument/2006/relationships" xmlns:m="http://schemas.openxmlformats.org/officeDocument/2006/math" xmlns:v="urn:schemas-microsoft-com:vml" xmlns:wp14="http://schemas.microsoft.com/office/word/2010/wordprocessingDrawing" xmlns:wp="http://schemas.openxmlformats.org/drawingml/2006/wordprocessingDrawing" xmlns:w10="urn:schemas-microsoft-com:office:word" xmlns:w="http://schemas.openxmlformats.org/wordprocessingml/2006/main" xmlns:w14="http://schemas.microsoft.com/office/word/2010/wordml" xmlns:w15="http://schemas.microsoft.com/office/word/2012/wordml" xmlns:w16se="http://schemas.microsoft.com/office/word/2015/wordml/symex" xmlns:wpg="http://schemas.microsoft.com/office/word/2010/wordprocessingGroup" xmlns:wpi="http://schemas.microsoft.com/office/word/2010/wordprocessingInk" xmlns:wne="http://schemas.microsoft.com/office/word/2006/wordml" xmlns:wps="http://schemas.microsoft.com/office/word/2010/wordprocessingShape" mc:Ignorable="w14 w15 w16se wp14">
   <w:body>
     <w:tbl>
       <w:tblPr>
@@ -237,11 +237,9 @@
             <w:pPr>
               <w:pStyle w:val="aa"/>
             </w:pPr>
-            <w:proofErr w:type="spellStart"/>
             <w:r>
               <w:t>과업명</w:t>
             </w:r>
-            <w:proofErr w:type="spellEnd"/>
           </w:p>
         </w:tc>
         <w:tc>
@@ -261,14 +259,12 @@
             <w:pPr>
               <w:pStyle w:val="aa"/>
             </w:pPr>
-            <w:proofErr w:type="spellStart"/>
             <w:r>
               <w:rPr>
                 <w:rFonts w:hint="eastAsia"/>
               </w:rPr>
               <w:t>유기견</w:t>
             </w:r>
-            <w:proofErr w:type="spellEnd"/>
             <w:r>
               <w:t xml:space="preserve"> </w:t>
             </w:r>
@@ -518,7 +514,7 @@
               <w:wordWrap/>
               <w:jc w:val="center"/>
               <w:rPr>
-                <w:rFonts w:ascii="맑은 고딕" w:eastAsia="맑은 고딕" w:hAnsi="맑은 고딕" w:hint="eastAsia"/>
+                <w:rFonts w:ascii="맑은 고딕" w:eastAsia="맑은 고딕" w:hAnsi="맑은 고딕"/>
                 <w:sz w:val="36"/>
               </w:rPr>
             </w:pPr>
@@ -870,7 +866,10 @@
               <w:pStyle w:val="a9"/>
             </w:pPr>
             <w:r>
-              <w:t>V</w:t>
+              <w:rPr>
+                <w:rFonts w:hint="eastAsia"/>
+              </w:rPr>
+              <w:t>v</w:t>
             </w:r>
             <w:r>
               <w:rPr>
@@ -2429,13 +2428,9 @@
     <w:sdt>
       <w:sdtPr>
         <w:rPr>
-          <w:rFonts w:ascii="맑은 고딕" w:eastAsia="맑은 고딕" w:hAnsi="맑은 고딕" w:cstheme="majorBidi"/>
-          <w:b/>
-          <w:sz w:val="32"/>
-          <w:szCs w:val="28"/>
           <w:lang w:val="ko-KR"/>
         </w:rPr>
-        <w:id w:val="-416859241"/>
+        <w:id w:val="-792527907"/>
         <w:docPartObj>
           <w:docPartGallery w:val="Table of Contents"/>
           <w:docPartUnique/>
@@ -2443,19 +2438,25 @@
       </w:sdtPr>
       <w:sdtEndPr>
         <w:rPr>
-          <w:rFonts w:asciiTheme="majorHAnsi" w:hAnsiTheme="majorHAnsi"/>
+          <w:rFonts w:asciiTheme="minorHAnsi" w:eastAsia="휴먼명조" w:hAnsiTheme="minorHAnsi" w:cstheme="minorBidi"/>
+          <w:b/>
+          <w:bCs/>
+          <w:color w:val="auto"/>
+          <w:kern w:val="2"/>
+          <w:sz w:val="22"/>
+          <w:szCs w:val="20"/>
         </w:rPr>
       </w:sdtEndPr>
       <w:sdtContent>
         <w:p>
+          <w:pPr>
+            <w:pStyle w:val="TOC"/>
+          </w:pPr>
           <w:r>
             <w:rPr>
-              <w:rFonts w:ascii="맑은 고딕" w:eastAsia="맑은 고딕" w:hAnsi="맑은 고딕" w:hint="eastAsia"/>
-              <w:sz w:val="32"/>
-              <w:szCs w:val="28"/>
               <w:lang w:val="ko-KR"/>
             </w:rPr>
-            <w:t>목차</w:t>
+            <w:t>내용</w:t>
           </w:r>
         </w:p>
         <w:p>
@@ -2480,7 +2481,7 @@
           <w:r>
             <w:fldChar w:fldCharType="separate"/>
           </w:r>
-          <w:hyperlink w:anchor="_Toc55046360" w:history="1">
+          <w:hyperlink w:anchor="_Toc234421309" w:history="1">
             <w:r>
               <w:rPr>
                 <w:rStyle w:val="a5"/>
@@ -2513,7 +2514,47 @@
                 <w:webHidden/>
               </w:rPr>
               <w:tab/>
-              <w:t>9</w:t>
+            </w:r>
+            <w:r>
+              <w:rPr>
+                <w:noProof/>
+                <w:webHidden/>
+              </w:rPr>
+              <w:fldChar w:fldCharType="begin"/>
+            </w:r>
+            <w:r>
+              <w:rPr>
+                <w:noProof/>
+                <w:webHidden/>
+              </w:rPr>
+              <w:instrText xml:space="preserve"> PAGEREF _Toc234421309 \h </w:instrText>
+            </w:r>
+            <w:r>
+              <w:rPr>
+                <w:noProof/>
+                <w:webHidden/>
+              </w:rPr>
+            </w:r>
+            <w:r>
+              <w:rPr>
+                <w:noProof/>
+                <w:webHidden/>
+              </w:rPr>
+              <w:fldChar w:fldCharType="separate"/>
+            </w:r>
+            <w:r>
+              <w:rPr>
+                <w:noProof/>
+                <w:webHidden/>
+              </w:rPr>
+              <w:t>4</w:t>
+            </w:r>
+            <w:r>
+              <w:rPr>
+                <w:noProof/>
+                <w:webHidden/>
+              </w:rPr>
+              <w:fldChar w:fldCharType="end"/>
             </w:r>
           </w:hyperlink>
         </w:p>
@@ -2530,7 +2571,7 @@
               <w:szCs w:val="22"/>
             </w:rPr>
           </w:pPr>
-          <w:hyperlink w:anchor="_Toc55046361" w:history="1">
+          <w:hyperlink w:anchor="_Toc234421310" w:history="1">
             <w:r>
               <w:rPr>
                 <w:rStyle w:val="a5"/>
@@ -2563,7 +2604,47 @@
                 <w:webHidden/>
               </w:rPr>
               <w:tab/>
-              <w:t>10</w:t>
+            </w:r>
+            <w:r>
+              <w:rPr>
+                <w:noProof/>
+                <w:webHidden/>
+              </w:rPr>
+              <w:fldChar w:fldCharType="begin"/>
+            </w:r>
+            <w:r>
+              <w:rPr>
+                <w:noProof/>
+                <w:webHidden/>
+              </w:rPr>
+              <w:instrText xml:space="preserve"> PAGEREF _Toc234421310 \h </w:instrText>
+            </w:r>
+            <w:r>
+              <w:rPr>
+                <w:noProof/>
+                <w:webHidden/>
+              </w:rPr>
+            </w:r>
+            <w:r>
+              <w:rPr>
+                <w:noProof/>
+                <w:webHidden/>
+              </w:rPr>
+              <w:fldChar w:fldCharType="separate"/>
+            </w:r>
+            <w:r>
+              <w:rPr>
+                <w:noProof/>
+                <w:webHidden/>
+              </w:rPr>
+              <w:t>23</w:t>
+            </w:r>
+            <w:r>
+              <w:rPr>
+                <w:noProof/>
+                <w:webHidden/>
+              </w:rPr>
+              <w:fldChar w:fldCharType="end"/>
             </w:r>
           </w:hyperlink>
         </w:p>
@@ -2580,32 +2661,13 @@
               <w:szCs w:val="22"/>
             </w:rPr>
           </w:pPr>
-          <w:hyperlink w:anchor="_Toc55046362" w:history="1">
+          <w:hyperlink w:anchor="_Toc234421311" w:history="1">
             <w:r>
               <w:rPr>
                 <w:rStyle w:val="a5"/>
                 <w:noProof/>
               </w:rPr>
-              <w:t>3.</w:t>
-            </w:r>
-            <w:r>
-              <w:rPr>
-                <w:rFonts w:asciiTheme="minorHAnsi" w:eastAsiaTheme="minorEastAsia" w:hAnsiTheme="minorHAnsi" w:cstheme="minorBidi"/>
-                <w:b w:val="0"/>
-                <w:bCs w:val="0"/>
-                <w:noProof/>
-                <w:kern w:val="2"/>
-                <w:sz w:val="20"/>
-                <w:szCs w:val="22"/>
-              </w:rPr>
-              <w:tab/>
-            </w:r>
-            <w:r>
-              <w:rPr>
-                <w:rStyle w:val="a5"/>
-                <w:noProof/>
-              </w:rPr>
-              <w:t>상세 수행 내역</w:t>
+              <w:t>3. 상세 수행 내역</w:t>
             </w:r>
             <w:r>
               <w:rPr>
@@ -2613,21 +2675,55 @@
                 <w:webHidden/>
               </w:rPr>
               <w:tab/>
-              <w:t>10</w:t>
+            </w:r>
+            <w:r>
+              <w:rPr>
+                <w:noProof/>
+                <w:webHidden/>
+              </w:rPr>
+              <w:fldChar w:fldCharType="begin"/>
+            </w:r>
+            <w:r>
+              <w:rPr>
+                <w:noProof/>
+                <w:webHidden/>
+              </w:rPr>
+              <w:instrText xml:space="preserve"> PAGEREF _Toc234421311 \h </w:instrText>
+            </w:r>
+            <w:r>
+              <w:rPr>
+                <w:noProof/>
+                <w:webHidden/>
+              </w:rPr>
+            </w:r>
+            <w:r>
+              <w:rPr>
+                <w:noProof/>
+                <w:webHidden/>
+              </w:rPr>
+              <w:fldChar w:fldCharType="separate"/>
+            </w:r>
+            <w:r>
+              <w:rPr>
+                <w:noProof/>
+                <w:webHidden/>
+              </w:rPr>
+              <w:t>23</w:t>
+            </w:r>
+            <w:r>
+              <w:rPr>
+                <w:noProof/>
+                <w:webHidden/>
+              </w:rPr>
+              <w:fldChar w:fldCharType="end"/>
             </w:r>
           </w:hyperlink>
         </w:p>
         <w:p>
-          <w:pPr>
-            <w:pStyle w:val="3"/>
-            <w:ind w:left="1000" w:hanging="400"/>
-            <w:rPr>
-              <w:rFonts w:asciiTheme="minorHAnsi" w:eastAsia="휴먼명조" w:hAnsiTheme="minorHAnsi" w:cstheme="minorBidi"/>
-              <w:lang w:val="ko-KR"/>
-            </w:rPr>
-          </w:pPr>
           <w:r>
             <w:rPr>
+              <w:b/>
+              <w:bCs/>
               <w:lang w:val="ko-KR"/>
             </w:rPr>
             <w:fldChar w:fldCharType="end"/>
@@ -2660,11 +2756,13 @@
         <w:pStyle w:val="1"/>
       </w:pPr>
       <w:bookmarkStart w:id="0" w:name="_Toc55046366"/>
+      <w:bookmarkStart w:id="1" w:name="_Toc234421309"/>
       <w:r>
         <w:lastRenderedPageBreak/>
         <w:t>개요</w:t>
       </w:r>
       <w:bookmarkEnd w:id="0"/>
+      <w:bookmarkEnd w:id="1"/>
     </w:p>
     <w:p>
       <w:pPr>
@@ -2691,31 +2789,7 @@
         <w:pStyle w:val="a"/>
       </w:pPr>
       <w:r>
-        <w:t xml:space="preserve">본 사업은 </w:t>
-      </w:r>
-      <w:proofErr w:type="spellStart"/>
-      <w:r>
-        <w:t>딩동독</w:t>
-      </w:r>
-      <w:proofErr w:type="spellEnd"/>
-      <w:r>
-        <w:t>(</w:t>
-      </w:r>
-      <w:proofErr w:type="spellStart"/>
-      <w:r>
-        <w:t>DingDongDog</w:t>
-      </w:r>
-      <w:proofErr w:type="spellEnd"/>
-      <w:r>
-        <w:t xml:space="preserve">!) 플랫폼의 핵심 데이터 보호와 서비스 무결성 확보를 최우선 과제로 수행한다. 네트워크 망 분리와 다층 방어 체계를 통해 외부 위협을 원천 차단하고, 엄격한 접근 제어와 정기적인 취약점 점검을 통해 보안 체계를 상시 최적화한다. 또한, 고도화된 통합 보안 관제 체계를 수립하여 침해 사고에 대한 </w:t>
-      </w:r>
-      <w:proofErr w:type="spellStart"/>
-      <w:r>
-        <w:t>선제적</w:t>
-      </w:r>
-      <w:proofErr w:type="spellEnd"/>
-      <w:r>
-        <w:t xml:space="preserve"> 대응 역량을 강화함으로써, 이용자가 안심할 수 있는 안전하고 견고한 플랫폼 운영 기반을 마련하고자 한다.</w:t>
+        <w:t>본 사업은 딩동독(DingDongDog!) 플랫폼의 핵심 데이터 보호와 서비스 무결성 확보를 최우선 과제로 수행한다. 네트워크 망 분리와 다층 방어 체계를 통해 외부 위협을 원천 차단하고, 엄격한 접근 제어와 정기적인 취약점 점검을 통해 보안 체계를 상시 최적화한다. 또한, 고도화된 통합 보안 관제 체계를 수립하여 침해 사고에 대한 선제적 대응 역량을 강화함으로써, 이용자가 안심할 수 있는 안전하고 견고한 플랫폼 운영 기반을 마련하고자 한다.</w:t>
       </w:r>
     </w:p>
     <w:p>
@@ -4191,7 +4265,6 @@
                 <w:sz w:val="20"/>
               </w:rPr>
             </w:pPr>
-            <w:proofErr w:type="spellStart"/>
             <w:r>
               <w:rPr>
                 <w:rFonts w:asciiTheme="majorHAnsi" w:eastAsiaTheme="majorHAnsi" w:hAnsiTheme="majorHAnsi" w:cs="굴림" w:hint="eastAsia"/>
@@ -4200,7 +4273,6 @@
               </w:rPr>
               <w:t>뉴스웹서비스</w:t>
             </w:r>
-            <w:proofErr w:type="spellEnd"/>
           </w:p>
         </w:tc>
       </w:tr>
@@ -6295,7 +6367,6 @@
                 <w:sz w:val="20"/>
               </w:rPr>
             </w:pPr>
-            <w:proofErr w:type="spellStart"/>
             <w:r>
               <w:rPr>
                 <w:rFonts w:asciiTheme="majorHAnsi" w:eastAsiaTheme="majorHAnsi" w:hAnsiTheme="majorHAnsi" w:cs="굴림" w:hint="eastAsia"/>
@@ -6304,7 +6375,6 @@
               </w:rPr>
               <w:t>MainDB</w:t>
             </w:r>
-            <w:proofErr w:type="spellEnd"/>
           </w:p>
         </w:tc>
       </w:tr>
@@ -7257,27 +7327,7 @@
                 <w:sz w:val="24"/>
                 <w:szCs w:val="24"/>
               </w:rPr>
-              <w:t xml:space="preserve">계정 잠금 </w:t>
-            </w:r>
-            <w:proofErr w:type="spellStart"/>
-            <w:r>
-              <w:rPr>
-                <w:rFonts w:asciiTheme="majorHAnsi" w:eastAsiaTheme="majorHAnsi" w:hAnsiTheme="majorHAnsi" w:cs="굴림"/>
-                <w:kern w:val="0"/>
-                <w:sz w:val="24"/>
-                <w:szCs w:val="24"/>
-              </w:rPr>
-              <w:t>임계값</w:t>
-            </w:r>
-            <w:proofErr w:type="spellEnd"/>
-            <w:r>
-              <w:rPr>
-                <w:rFonts w:asciiTheme="majorHAnsi" w:eastAsiaTheme="majorHAnsi" w:hAnsiTheme="majorHAnsi" w:cs="굴림"/>
-                <w:kern w:val="0"/>
-                <w:sz w:val="24"/>
-                <w:szCs w:val="24"/>
-              </w:rPr>
-              <w:t xml:space="preserve"> 설정</w:t>
+              <w:t>계정 잠금 임계값 설정</w:t>
             </w:r>
           </w:p>
         </w:tc>
@@ -7536,27 +7586,7 @@
                 <w:sz w:val="24"/>
                 <w:szCs w:val="24"/>
               </w:rPr>
-              <w:t xml:space="preserve">사용자 계정 </w:t>
-            </w:r>
-            <w:proofErr w:type="spellStart"/>
-            <w:r>
-              <w:rPr>
-                <w:rFonts w:asciiTheme="majorHAnsi" w:eastAsiaTheme="majorHAnsi" w:hAnsiTheme="majorHAnsi" w:cs="굴림"/>
-                <w:kern w:val="0"/>
-                <w:sz w:val="24"/>
-                <w:szCs w:val="24"/>
-              </w:rPr>
-              <w:t>su</w:t>
-            </w:r>
-            <w:proofErr w:type="spellEnd"/>
-            <w:r>
-              <w:rPr>
-                <w:rFonts w:asciiTheme="majorHAnsi" w:eastAsiaTheme="majorHAnsi" w:hAnsiTheme="majorHAnsi" w:cs="굴림"/>
-                <w:kern w:val="0"/>
-                <w:sz w:val="24"/>
-                <w:szCs w:val="24"/>
-              </w:rPr>
-              <w:t xml:space="preserve"> 기능 제한</w:t>
+              <w:t>사용자 계정 su 기능 제한</w:t>
             </w:r>
           </w:p>
         </w:tc>
@@ -8554,27 +8584,7 @@
                 <w:sz w:val="24"/>
                 <w:szCs w:val="24"/>
               </w:rPr>
-              <w:t>/</w:t>
-            </w:r>
-            <w:proofErr w:type="spellStart"/>
-            <w:r>
-              <w:rPr>
-                <w:rFonts w:asciiTheme="majorHAnsi" w:eastAsiaTheme="majorHAnsi" w:hAnsiTheme="majorHAnsi" w:cs="굴림"/>
-                <w:kern w:val="0"/>
-                <w:sz w:val="24"/>
-                <w:szCs w:val="24"/>
-              </w:rPr>
-              <w:t>etc</w:t>
-            </w:r>
-            <w:proofErr w:type="spellEnd"/>
-            <w:r>
-              <w:rPr>
-                <w:rFonts w:asciiTheme="majorHAnsi" w:eastAsiaTheme="majorHAnsi" w:hAnsiTheme="majorHAnsi" w:cs="굴림"/>
-                <w:kern w:val="0"/>
-                <w:sz w:val="24"/>
-                <w:szCs w:val="24"/>
-              </w:rPr>
-              <w:t>/passwd 파일 소유자 및 권한 설정</w:t>
+              <w:t>/etc/passwd 파일 소유자 및 권한 설정</w:t>
             </w:r>
           </w:p>
         </w:tc>
@@ -8746,27 +8756,7 @@
                 <w:sz w:val="24"/>
                 <w:szCs w:val="24"/>
               </w:rPr>
-              <w:t>/</w:t>
-            </w:r>
-            <w:proofErr w:type="spellStart"/>
-            <w:r>
-              <w:rPr>
-                <w:rFonts w:asciiTheme="majorHAnsi" w:eastAsiaTheme="majorHAnsi" w:hAnsiTheme="majorHAnsi" w:cs="굴림"/>
-                <w:kern w:val="0"/>
-                <w:sz w:val="24"/>
-                <w:szCs w:val="24"/>
-              </w:rPr>
-              <w:t>etc</w:t>
-            </w:r>
-            <w:proofErr w:type="spellEnd"/>
-            <w:r>
-              <w:rPr>
-                <w:rFonts w:asciiTheme="majorHAnsi" w:eastAsiaTheme="majorHAnsi" w:hAnsiTheme="majorHAnsi" w:cs="굴림"/>
-                <w:kern w:val="0"/>
-                <w:sz w:val="24"/>
-                <w:szCs w:val="24"/>
-              </w:rPr>
-              <w:t>/shadow 파일 소유자 및 권한 설정</w:t>
+              <w:t>/etc/shadow 파일 소유자 및 권한 설정</w:t>
             </w:r>
           </w:p>
         </w:tc>
@@ -8852,27 +8842,7 @@
                 <w:sz w:val="24"/>
                 <w:szCs w:val="24"/>
               </w:rPr>
-              <w:t>/</w:t>
-            </w:r>
-            <w:proofErr w:type="spellStart"/>
-            <w:r>
-              <w:rPr>
-                <w:rFonts w:asciiTheme="majorHAnsi" w:eastAsiaTheme="majorHAnsi" w:hAnsiTheme="majorHAnsi" w:cs="굴림"/>
-                <w:kern w:val="0"/>
-                <w:sz w:val="24"/>
-                <w:szCs w:val="24"/>
-              </w:rPr>
-              <w:t>etc</w:t>
-            </w:r>
-            <w:proofErr w:type="spellEnd"/>
-            <w:r>
-              <w:rPr>
-                <w:rFonts w:asciiTheme="majorHAnsi" w:eastAsiaTheme="majorHAnsi" w:hAnsiTheme="majorHAnsi" w:cs="굴림"/>
-                <w:kern w:val="0"/>
-                <w:sz w:val="24"/>
-                <w:szCs w:val="24"/>
-              </w:rPr>
-              <w:t>/hosts 파일 소유자 및 권한 설정</w:t>
+              <w:t>/etc/hosts 파일 소유자 및 권한 설정</w:t>
             </w:r>
           </w:p>
         </w:tc>
@@ -8958,47 +8928,7 @@
                 <w:sz w:val="24"/>
                 <w:szCs w:val="24"/>
               </w:rPr>
-              <w:t>/</w:t>
-            </w:r>
-            <w:proofErr w:type="spellStart"/>
-            <w:r>
-              <w:rPr>
-                <w:rFonts w:asciiTheme="majorHAnsi" w:eastAsiaTheme="majorHAnsi" w:hAnsiTheme="majorHAnsi" w:cs="굴림"/>
-                <w:kern w:val="0"/>
-                <w:sz w:val="24"/>
-                <w:szCs w:val="24"/>
-              </w:rPr>
-              <w:t>etc</w:t>
-            </w:r>
-            <w:proofErr w:type="spellEnd"/>
-            <w:r>
-              <w:rPr>
-                <w:rFonts w:asciiTheme="majorHAnsi" w:eastAsiaTheme="majorHAnsi" w:hAnsiTheme="majorHAnsi" w:cs="굴림"/>
-                <w:kern w:val="0"/>
-                <w:sz w:val="24"/>
-                <w:szCs w:val="24"/>
-              </w:rPr>
-              <w:t>/(x)</w:t>
-            </w:r>
-            <w:proofErr w:type="spellStart"/>
-            <w:r>
-              <w:rPr>
-                <w:rFonts w:asciiTheme="majorHAnsi" w:eastAsiaTheme="majorHAnsi" w:hAnsiTheme="majorHAnsi" w:cs="굴림"/>
-                <w:kern w:val="0"/>
-                <w:sz w:val="24"/>
-                <w:szCs w:val="24"/>
-              </w:rPr>
-              <w:t>inetd.conf</w:t>
-            </w:r>
-            <w:proofErr w:type="spellEnd"/>
-            <w:r>
-              <w:rPr>
-                <w:rFonts w:asciiTheme="majorHAnsi" w:eastAsiaTheme="majorHAnsi" w:hAnsiTheme="majorHAnsi" w:cs="굴림"/>
-                <w:kern w:val="0"/>
-                <w:sz w:val="24"/>
-                <w:szCs w:val="24"/>
-              </w:rPr>
-              <w:t xml:space="preserve"> 파일 소유자 및 권한 설정</w:t>
+              <w:t>/etc/(x)inetd.conf 파일 소유자 및 권한 설정</w:t>
             </w:r>
           </w:p>
         </w:tc>
@@ -9084,47 +9014,7 @@
                 <w:sz w:val="24"/>
                 <w:szCs w:val="24"/>
               </w:rPr>
-              <w:t>/</w:t>
-            </w:r>
-            <w:proofErr w:type="spellStart"/>
-            <w:r>
-              <w:rPr>
-                <w:rFonts w:asciiTheme="majorHAnsi" w:eastAsiaTheme="majorHAnsi" w:hAnsiTheme="majorHAnsi" w:cs="굴림"/>
-                <w:kern w:val="0"/>
-                <w:sz w:val="24"/>
-                <w:szCs w:val="24"/>
-              </w:rPr>
-              <w:t>etc</w:t>
-            </w:r>
-            <w:proofErr w:type="spellEnd"/>
-            <w:r>
-              <w:rPr>
-                <w:rFonts w:asciiTheme="majorHAnsi" w:eastAsiaTheme="majorHAnsi" w:hAnsiTheme="majorHAnsi" w:cs="굴림"/>
-                <w:kern w:val="0"/>
-                <w:sz w:val="24"/>
-                <w:szCs w:val="24"/>
-              </w:rPr>
-              <w:t>/(r)</w:t>
-            </w:r>
-            <w:proofErr w:type="spellStart"/>
-            <w:r>
-              <w:rPr>
-                <w:rFonts w:asciiTheme="majorHAnsi" w:eastAsiaTheme="majorHAnsi" w:hAnsiTheme="majorHAnsi" w:cs="굴림"/>
-                <w:kern w:val="0"/>
-                <w:sz w:val="24"/>
-                <w:szCs w:val="24"/>
-              </w:rPr>
-              <w:t>syslog.conf</w:t>
-            </w:r>
-            <w:proofErr w:type="spellEnd"/>
-            <w:r>
-              <w:rPr>
-                <w:rFonts w:asciiTheme="majorHAnsi" w:eastAsiaTheme="majorHAnsi" w:hAnsiTheme="majorHAnsi" w:cs="굴림"/>
-                <w:kern w:val="0"/>
-                <w:sz w:val="24"/>
-                <w:szCs w:val="24"/>
-              </w:rPr>
-              <w:t xml:space="preserve"> 파일 소유자 및 권한 설정</w:t>
+              <w:t>/etc/(r)syslog.conf 파일 소유자 및 권한 설정</w:t>
             </w:r>
           </w:p>
         </w:tc>
@@ -9210,27 +9100,7 @@
                 <w:sz w:val="24"/>
                 <w:szCs w:val="24"/>
               </w:rPr>
-              <w:t>/</w:t>
-            </w:r>
-            <w:proofErr w:type="spellStart"/>
-            <w:r>
-              <w:rPr>
-                <w:rFonts w:asciiTheme="majorHAnsi" w:eastAsiaTheme="majorHAnsi" w:hAnsiTheme="majorHAnsi" w:cs="굴림"/>
-                <w:kern w:val="0"/>
-                <w:sz w:val="24"/>
-                <w:szCs w:val="24"/>
-              </w:rPr>
-              <w:t>etc</w:t>
-            </w:r>
-            <w:proofErr w:type="spellEnd"/>
-            <w:r>
-              <w:rPr>
-                <w:rFonts w:asciiTheme="majorHAnsi" w:eastAsiaTheme="majorHAnsi" w:hAnsiTheme="majorHAnsi" w:cs="굴림"/>
-                <w:kern w:val="0"/>
-                <w:sz w:val="24"/>
-                <w:szCs w:val="24"/>
-              </w:rPr>
-              <w:t>/services 파일 소유자 및 권한 설정</w:t>
+              <w:t>/etc/services 파일 소유자 및 권한 설정</w:t>
             </w:r>
           </w:p>
         </w:tc>
@@ -9660,49 +9530,7 @@
                 <w:sz w:val="24"/>
                 <w:szCs w:val="24"/>
               </w:rPr>
-              <w:t>$HOME/.</w:t>
-            </w:r>
-            <w:proofErr w:type="spellStart"/>
-            <w:r>
-              <w:rPr>
-                <w:rFonts w:asciiTheme="majorHAnsi" w:eastAsiaTheme="majorHAnsi" w:hAnsiTheme="majorHAnsi" w:cs="굴림"/>
-                <w:kern w:val="0"/>
-                <w:sz w:val="24"/>
-                <w:szCs w:val="24"/>
-              </w:rPr>
-              <w:t>rhosts</w:t>
-            </w:r>
-            <w:proofErr w:type="spellEnd"/>
-            <w:r>
-              <w:rPr>
-                <w:rFonts w:asciiTheme="majorHAnsi" w:eastAsiaTheme="majorHAnsi" w:hAnsiTheme="majorHAnsi" w:cs="굴림"/>
-                <w:kern w:val="0"/>
-                <w:sz w:val="24"/>
-                <w:szCs w:val="24"/>
-              </w:rPr>
-              <w:t xml:space="preserve">, </w:t>
-            </w:r>
-            <w:proofErr w:type="spellStart"/>
-            <w:proofErr w:type="gramStart"/>
-            <w:r>
-              <w:rPr>
-                <w:rFonts w:asciiTheme="majorHAnsi" w:eastAsiaTheme="majorHAnsi" w:hAnsiTheme="majorHAnsi" w:cs="굴림"/>
-                <w:kern w:val="0"/>
-                <w:sz w:val="24"/>
-                <w:szCs w:val="24"/>
-              </w:rPr>
-              <w:t>hosts.equiv</w:t>
-            </w:r>
-            <w:proofErr w:type="spellEnd"/>
-            <w:proofErr w:type="gramEnd"/>
-            <w:r>
-              <w:rPr>
-                <w:rFonts w:asciiTheme="majorHAnsi" w:eastAsiaTheme="majorHAnsi" w:hAnsiTheme="majorHAnsi" w:cs="굴림"/>
-                <w:kern w:val="0"/>
-                <w:sz w:val="24"/>
-                <w:szCs w:val="24"/>
-              </w:rPr>
-              <w:t xml:space="preserve"> 사용 금지</w:t>
+              <w:t>$HOME/.rhosts, hosts.equiv 사용 금지</w:t>
             </w:r>
           </w:p>
         </w:tc>
@@ -9867,25 +9695,14 @@
                 <w:szCs w:val="24"/>
               </w:rPr>
             </w:pPr>
-            <w:proofErr w:type="spellStart"/>
-            <w:r>
-              <w:rPr>
-                <w:rFonts w:asciiTheme="majorHAnsi" w:eastAsiaTheme="majorHAnsi" w:hAnsiTheme="majorHAnsi" w:cs="굴림"/>
-                <w:kern w:val="0"/>
-                <w:sz w:val="24"/>
-                <w:szCs w:val="24"/>
-              </w:rPr>
-              <w:t>hosts.lpd</w:t>
-            </w:r>
-            <w:proofErr w:type="spellEnd"/>
-            <w:r>
-              <w:rPr>
-                <w:rFonts w:asciiTheme="majorHAnsi" w:eastAsiaTheme="majorHAnsi" w:hAnsiTheme="majorHAnsi" w:cs="굴림"/>
-                <w:kern w:val="0"/>
-                <w:sz w:val="24"/>
-                <w:szCs w:val="24"/>
-              </w:rPr>
-              <w:t xml:space="preserve"> 파일 소유자 및 권한 설정</w:t>
+            <w:r>
+              <w:rPr>
+                <w:rFonts w:asciiTheme="majorHAnsi" w:eastAsiaTheme="majorHAnsi" w:hAnsiTheme="majorHAnsi" w:cs="굴림"/>
+                <w:kern w:val="0"/>
+                <w:sz w:val="24"/>
+                <w:szCs w:val="24"/>
+              </w:rPr>
+              <w:t>hosts.lpd 파일 소유자 및 권한 설정</w:t>
             </w:r>
           </w:p>
         </w:tc>
@@ -10355,7 +10172,20 @@
                 <w:sz w:val="24"/>
                 <w:szCs w:val="24"/>
               </w:rPr>
-              <w:t>점검항목</w:t>
+              <w:t>점검</w:t>
+            </w:r>
+            <w:bookmarkStart w:id="2" w:name="_GoBack"/>
+            <w:bookmarkEnd w:id="2"/>
+            <w:r>
+              <w:rPr>
+                <w:rFonts w:asciiTheme="majorHAnsi" w:eastAsiaTheme="majorHAnsi" w:hAnsiTheme="majorHAnsi" w:cs="굴림"/>
+                <w:b/>
+                <w:bCs/>
+                <w:kern w:val="0"/>
+                <w:sz w:val="24"/>
+                <w:szCs w:val="24"/>
+              </w:rPr>
+              <w:t>항목</w:t>
             </w:r>
           </w:p>
         </w:tc>
@@ -11053,27 +10883,7 @@
                 <w:sz w:val="24"/>
                 <w:szCs w:val="24"/>
               </w:rPr>
-              <w:t xml:space="preserve">불필요한 </w:t>
-            </w:r>
-            <w:proofErr w:type="spellStart"/>
-            <w:r>
-              <w:rPr>
-                <w:rFonts w:asciiTheme="majorHAnsi" w:eastAsiaTheme="majorHAnsi" w:hAnsiTheme="majorHAnsi" w:cs="굴림"/>
-                <w:kern w:val="0"/>
-                <w:sz w:val="24"/>
-                <w:szCs w:val="24"/>
-              </w:rPr>
-              <w:t>automountd</w:t>
-            </w:r>
-            <w:proofErr w:type="spellEnd"/>
-            <w:r>
-              <w:rPr>
-                <w:rFonts w:asciiTheme="majorHAnsi" w:eastAsiaTheme="majorHAnsi" w:hAnsiTheme="majorHAnsi" w:cs="굴림"/>
-                <w:kern w:val="0"/>
-                <w:sz w:val="24"/>
-                <w:szCs w:val="24"/>
-              </w:rPr>
-              <w:t xml:space="preserve"> 제거</w:t>
+              <w:t>불필요한 automountd 제거</w:t>
             </w:r>
           </w:p>
         </w:tc>
@@ -11324,25 +11134,14 @@
                 <w:szCs w:val="24"/>
               </w:rPr>
             </w:pPr>
-            <w:proofErr w:type="spellStart"/>
-            <w:r>
-              <w:rPr>
-                <w:rFonts w:asciiTheme="majorHAnsi" w:eastAsiaTheme="majorHAnsi" w:hAnsiTheme="majorHAnsi" w:cs="굴림"/>
-                <w:kern w:val="0"/>
-                <w:sz w:val="24"/>
-                <w:szCs w:val="24"/>
-              </w:rPr>
-              <w:t>tftp</w:t>
-            </w:r>
-            <w:proofErr w:type="spellEnd"/>
-            <w:r>
-              <w:rPr>
-                <w:rFonts w:asciiTheme="majorHAnsi" w:eastAsiaTheme="majorHAnsi" w:hAnsiTheme="majorHAnsi" w:cs="굴림"/>
-                <w:kern w:val="0"/>
-                <w:sz w:val="24"/>
-                <w:szCs w:val="24"/>
-              </w:rPr>
-              <w:t>, talk 서비스 비활성화</w:t>
+            <w:r>
+              <w:rPr>
+                <w:rFonts w:asciiTheme="majorHAnsi" w:eastAsiaTheme="majorHAnsi" w:hAnsiTheme="majorHAnsi" w:cs="굴림"/>
+                <w:kern w:val="0"/>
+                <w:sz w:val="24"/>
+                <w:szCs w:val="24"/>
+              </w:rPr>
+              <w:t>tftp, talk 서비스 비활성화</w:t>
             </w:r>
           </w:p>
         </w:tc>
@@ -11679,45 +11478,14 @@
                 <w:szCs w:val="24"/>
               </w:rPr>
             </w:pPr>
-            <w:proofErr w:type="spellStart"/>
-            <w:r>
-              <w:rPr>
-                <w:rFonts w:asciiTheme="majorHAnsi" w:eastAsiaTheme="majorHAnsi" w:hAnsiTheme="majorHAnsi" w:cs="굴림"/>
-                <w:kern w:val="0"/>
-                <w:sz w:val="24"/>
-                <w:szCs w:val="24"/>
-              </w:rPr>
-              <w:t>expn</w:t>
-            </w:r>
-            <w:proofErr w:type="spellEnd"/>
-            <w:r>
-              <w:rPr>
-                <w:rFonts w:asciiTheme="majorHAnsi" w:eastAsiaTheme="majorHAnsi" w:hAnsiTheme="majorHAnsi" w:cs="굴림"/>
-                <w:kern w:val="0"/>
-                <w:sz w:val="24"/>
-                <w:szCs w:val="24"/>
-              </w:rPr>
-              <w:t xml:space="preserve">, </w:t>
-            </w:r>
-            <w:proofErr w:type="spellStart"/>
-            <w:r>
-              <w:rPr>
-                <w:rFonts w:asciiTheme="majorHAnsi" w:eastAsiaTheme="majorHAnsi" w:hAnsiTheme="majorHAnsi" w:cs="굴림"/>
-                <w:kern w:val="0"/>
-                <w:sz w:val="24"/>
-                <w:szCs w:val="24"/>
-              </w:rPr>
-              <w:t>vrfy</w:t>
-            </w:r>
-            <w:proofErr w:type="spellEnd"/>
-            <w:r>
-              <w:rPr>
-                <w:rFonts w:asciiTheme="majorHAnsi" w:eastAsiaTheme="majorHAnsi" w:hAnsiTheme="majorHAnsi" w:cs="굴림"/>
-                <w:kern w:val="0"/>
-                <w:sz w:val="24"/>
-                <w:szCs w:val="24"/>
-              </w:rPr>
-              <w:t xml:space="preserve"> 명령어 제한</w:t>
+            <w:r>
+              <w:rPr>
+                <w:rFonts w:asciiTheme="majorHAnsi" w:eastAsiaTheme="majorHAnsi" w:hAnsiTheme="majorHAnsi" w:cs="굴림"/>
+                <w:kern w:val="0"/>
+                <w:sz w:val="24"/>
+                <w:szCs w:val="24"/>
+              </w:rPr>
+              <w:t>expn, vrfy 명령어 제한</w:t>
             </w:r>
           </w:p>
         </w:tc>
@@ -12484,25 +12252,14 @@
                 <w:szCs w:val="24"/>
               </w:rPr>
             </w:pPr>
-            <w:proofErr w:type="spellStart"/>
-            <w:r>
-              <w:rPr>
-                <w:rFonts w:asciiTheme="majorHAnsi" w:eastAsiaTheme="majorHAnsi" w:hAnsiTheme="majorHAnsi" w:cs="굴림"/>
-                <w:kern w:val="0"/>
-                <w:sz w:val="24"/>
-                <w:szCs w:val="24"/>
-              </w:rPr>
-              <w:t>Ftpusers</w:t>
-            </w:r>
-            <w:proofErr w:type="spellEnd"/>
-            <w:r>
-              <w:rPr>
-                <w:rFonts w:asciiTheme="majorHAnsi" w:eastAsiaTheme="majorHAnsi" w:hAnsiTheme="majorHAnsi" w:cs="굴림"/>
-                <w:kern w:val="0"/>
-                <w:sz w:val="24"/>
-                <w:szCs w:val="24"/>
-              </w:rPr>
-              <w:t xml:space="preserve"> 파일 설정</w:t>
+            <w:r>
+              <w:rPr>
+                <w:rFonts w:asciiTheme="majorHAnsi" w:eastAsiaTheme="majorHAnsi" w:hAnsiTheme="majorHAnsi" w:cs="굴림"/>
+                <w:kern w:val="0"/>
+                <w:sz w:val="24"/>
+                <w:szCs w:val="24"/>
+              </w:rPr>
+              <w:t>Ftpusers 파일 설정</w:t>
             </w:r>
           </w:p>
         </w:tc>
@@ -13011,7 +12768,6 @@
                 <w:szCs w:val="24"/>
               </w:rPr>
             </w:pPr>
-            <w:proofErr w:type="spellStart"/>
             <w:r>
               <w:rPr>
                 <w:rFonts w:asciiTheme="majorHAnsi" w:eastAsiaTheme="majorHAnsi" w:hAnsiTheme="majorHAnsi" w:cs="굴림"/>
@@ -13020,17 +12776,7 @@
                 <w:szCs w:val="24"/>
               </w:rPr>
               <w:lastRenderedPageBreak/>
-              <w:t>sudo</w:t>
-            </w:r>
-            <w:proofErr w:type="spellEnd"/>
-            <w:r>
-              <w:rPr>
-                <w:rFonts w:asciiTheme="majorHAnsi" w:eastAsiaTheme="majorHAnsi" w:hAnsiTheme="majorHAnsi" w:cs="굴림"/>
-                <w:kern w:val="0"/>
-                <w:sz w:val="24"/>
-                <w:szCs w:val="24"/>
-              </w:rPr>
-              <w:t xml:space="preserve"> 명령어 접근 관리</w:t>
+              <w:t>sudo 명령어 접근 관리</w:t>
             </w:r>
           </w:p>
         </w:tc>
@@ -14040,21 +13786,7 @@
               <w:rPr>
                 <w:rFonts w:asciiTheme="majorHAnsi" w:eastAsiaTheme="majorHAnsi" w:hAnsiTheme="majorHAnsi"/>
               </w:rPr>
-              <w:t xml:space="preserve">계정 잠금 </w:t>
-            </w:r>
-            <w:proofErr w:type="spellStart"/>
-            <w:r>
-              <w:rPr>
-                <w:rFonts w:asciiTheme="majorHAnsi" w:eastAsiaTheme="majorHAnsi" w:hAnsiTheme="majorHAnsi"/>
-              </w:rPr>
-              <w:t>임계값</w:t>
-            </w:r>
-            <w:proofErr w:type="spellEnd"/>
-            <w:r>
-              <w:rPr>
-                <w:rFonts w:asciiTheme="majorHAnsi" w:eastAsiaTheme="majorHAnsi" w:hAnsiTheme="majorHAnsi"/>
-              </w:rPr>
-              <w:t xml:space="preserve"> 설정</w:t>
+              <w:t>계정 잠금 임계값 설정</w:t>
             </w:r>
           </w:p>
         </w:tc>
@@ -17564,21 +17296,7 @@
               <w:rPr>
                 <w:rFonts w:asciiTheme="majorHAnsi" w:eastAsiaTheme="majorHAnsi" w:hAnsiTheme="majorHAnsi"/>
               </w:rPr>
-              <w:t xml:space="preserve">보안 감사를 </w:t>
-            </w:r>
-            <w:proofErr w:type="spellStart"/>
-            <w:r>
-              <w:rPr>
-                <w:rFonts w:asciiTheme="majorHAnsi" w:eastAsiaTheme="majorHAnsi" w:hAnsiTheme="majorHAnsi"/>
-              </w:rPr>
-              <w:t>로그할</w:t>
-            </w:r>
-            <w:proofErr w:type="spellEnd"/>
-            <w:r>
-              <w:rPr>
-                <w:rFonts w:asciiTheme="majorHAnsi" w:eastAsiaTheme="majorHAnsi" w:hAnsiTheme="majorHAnsi"/>
-              </w:rPr>
-              <w:t xml:space="preserve"> 수 없는 경우 즉시 시스템 종료</w:t>
+              <w:t>보안 감사를 로그할 수 없는 경우 즉시 시스템 종료</w:t>
             </w:r>
           </w:p>
         </w:tc>
@@ -17710,19 +17428,11 @@
                 <w:rFonts w:asciiTheme="majorHAnsi" w:eastAsiaTheme="majorHAnsi" w:hAnsiTheme="majorHAnsi"/>
               </w:rPr>
             </w:pPr>
-            <w:proofErr w:type="spellStart"/>
-            <w:r>
-              <w:rPr>
-                <w:rFonts w:asciiTheme="majorHAnsi" w:eastAsiaTheme="majorHAnsi" w:hAnsiTheme="majorHAnsi"/>
-              </w:rPr>
-              <w:t>Autologon</w:t>
-            </w:r>
-            <w:proofErr w:type="spellEnd"/>
-            <w:r>
-              <w:rPr>
-                <w:rFonts w:asciiTheme="majorHAnsi" w:eastAsiaTheme="majorHAnsi" w:hAnsiTheme="majorHAnsi"/>
-              </w:rPr>
-              <w:t xml:space="preserve"> 기능 제어</w:t>
+            <w:r>
+              <w:rPr>
+                <w:rFonts w:asciiTheme="majorHAnsi" w:eastAsiaTheme="majorHAnsi" w:hAnsiTheme="majorHAnsi"/>
+              </w:rPr>
+              <w:t>Autologon 기능 제어</w:t>
             </w:r>
           </w:p>
         </w:tc>
@@ -18727,21 +18437,7 @@
               <w:rPr>
                 <w:rFonts w:asciiTheme="majorHAnsi" w:eastAsiaTheme="majorHAnsi" w:hAnsiTheme="majorHAnsi"/>
               </w:rPr>
-              <w:t xml:space="preserve">Default 관리자 </w:t>
-            </w:r>
-            <w:proofErr w:type="spellStart"/>
-            <w:r>
-              <w:rPr>
-                <w:rFonts w:asciiTheme="majorHAnsi" w:eastAsiaTheme="majorHAnsi" w:hAnsiTheme="majorHAnsi"/>
-              </w:rPr>
-              <w:t>계정명</w:t>
-            </w:r>
-            <w:proofErr w:type="spellEnd"/>
-            <w:r>
-              <w:rPr>
-                <w:rFonts w:asciiTheme="majorHAnsi" w:eastAsiaTheme="majorHAnsi" w:hAnsiTheme="majorHAnsi"/>
-              </w:rPr>
-              <w:t xml:space="preserve"> 변경</w:t>
+              <w:t>Default 관리자 계정명 변경</w:t>
             </w:r>
           </w:p>
         </w:tc>
@@ -19012,15 +18708,7 @@
               <w:jc w:val="center"/>
             </w:pPr>
             <w:r>
-              <w:t xml:space="preserve">웹 서비스 디렉터리 </w:t>
-            </w:r>
-            <w:proofErr w:type="spellStart"/>
-            <w:r>
-              <w:t>리스팅</w:t>
-            </w:r>
-            <w:proofErr w:type="spellEnd"/>
-            <w:r>
-              <w:t xml:space="preserve"> 방지 설정</w:t>
+              <w:t>웹 서비스 디렉터리 리스팅 방지 설정</w:t>
             </w:r>
           </w:p>
         </w:tc>
@@ -19953,16 +19641,8 @@
               <w:rPr>
                 <w:rFonts w:asciiTheme="majorHAnsi" w:eastAsiaTheme="majorHAnsi" w:hAnsiTheme="majorHAnsi"/>
               </w:rPr>
-              <w:t xml:space="preserve">HTTP </w:t>
-            </w:r>
-            <w:proofErr w:type="spellStart"/>
-            <w:r>
-              <w:rPr>
-                <w:rFonts w:asciiTheme="majorHAnsi" w:eastAsiaTheme="majorHAnsi" w:hAnsiTheme="majorHAnsi"/>
-              </w:rPr>
-              <w:t>리디렉션</w:t>
-            </w:r>
-            <w:proofErr w:type="spellEnd"/>
+              <w:t>HTTP 리디렉션</w:t>
+            </w:r>
           </w:p>
         </w:tc>
         <w:tc>
@@ -20503,21 +20183,7 @@
               <w:rPr>
                 <w:rFonts w:asciiTheme="majorHAnsi" w:eastAsiaTheme="majorHAnsi" w:hAnsiTheme="majorHAnsi"/>
               </w:rPr>
-              <w:t xml:space="preserve">보안 장비 Default </w:t>
-            </w:r>
-            <w:proofErr w:type="spellStart"/>
-            <w:r>
-              <w:rPr>
-                <w:rFonts w:asciiTheme="majorHAnsi" w:eastAsiaTheme="majorHAnsi" w:hAnsiTheme="majorHAnsi"/>
-              </w:rPr>
-              <w:t>계정명</w:t>
-            </w:r>
-            <w:proofErr w:type="spellEnd"/>
-            <w:r>
-              <w:rPr>
-                <w:rFonts w:asciiTheme="majorHAnsi" w:eastAsiaTheme="majorHAnsi" w:hAnsiTheme="majorHAnsi"/>
-              </w:rPr>
-              <w:t xml:space="preserve"> 변경</w:t>
+              <w:t>보안 장비 Default 계정명 변경</w:t>
             </w:r>
           </w:p>
         </w:tc>
@@ -20777,21 +20443,7 @@
               <w:rPr>
                 <w:rFonts w:asciiTheme="majorHAnsi" w:eastAsiaTheme="majorHAnsi" w:hAnsiTheme="majorHAnsi"/>
               </w:rPr>
-              <w:t xml:space="preserve">계정 잠금 </w:t>
-            </w:r>
-            <w:proofErr w:type="spellStart"/>
-            <w:r>
-              <w:rPr>
-                <w:rFonts w:asciiTheme="majorHAnsi" w:eastAsiaTheme="majorHAnsi" w:hAnsiTheme="majorHAnsi"/>
-              </w:rPr>
-              <w:t>임계값</w:t>
-            </w:r>
-            <w:proofErr w:type="spellEnd"/>
-            <w:r>
-              <w:rPr>
-                <w:rFonts w:asciiTheme="majorHAnsi" w:eastAsiaTheme="majorHAnsi" w:hAnsiTheme="majorHAnsi"/>
-              </w:rPr>
-              <w:t xml:space="preserve"> 설정</w:t>
+              <w:t>계정 잠금 임계값 설정</w:t>
             </w:r>
           </w:p>
         </w:tc>
@@ -22710,21 +22362,7 @@
               <w:rPr>
                 <w:rFonts w:asciiTheme="majorHAnsi" w:eastAsiaTheme="majorHAnsi" w:hAnsiTheme="majorHAnsi"/>
               </w:rPr>
-              <w:t xml:space="preserve">계정 잠금 </w:t>
-            </w:r>
-            <w:proofErr w:type="spellStart"/>
-            <w:r>
-              <w:rPr>
-                <w:rFonts w:asciiTheme="majorHAnsi" w:eastAsiaTheme="majorHAnsi" w:hAnsiTheme="majorHAnsi"/>
-              </w:rPr>
-              <w:t>임계값</w:t>
-            </w:r>
-            <w:proofErr w:type="spellEnd"/>
-            <w:r>
-              <w:rPr>
-                <w:rFonts w:asciiTheme="majorHAnsi" w:eastAsiaTheme="majorHAnsi" w:hAnsiTheme="majorHAnsi"/>
-              </w:rPr>
-              <w:t xml:space="preserve"> 설정</w:t>
+              <w:t>계정 잠금 임계값 설정</w:t>
             </w:r>
           </w:p>
         </w:tc>
@@ -24710,19 +24348,11 @@
                 <w:rFonts w:asciiTheme="majorHAnsi" w:eastAsiaTheme="majorHAnsi" w:hAnsiTheme="majorHAnsi"/>
               </w:rPr>
             </w:pPr>
-            <w:proofErr w:type="spellStart"/>
-            <w:r>
-              <w:rPr>
-                <w:rFonts w:asciiTheme="majorHAnsi" w:eastAsiaTheme="majorHAnsi" w:hAnsiTheme="majorHAnsi"/>
-              </w:rPr>
-              <w:t>Bootp</w:t>
-            </w:r>
-            <w:proofErr w:type="spellEnd"/>
-            <w:r>
-              <w:rPr>
-                <w:rFonts w:asciiTheme="majorHAnsi" w:eastAsiaTheme="majorHAnsi" w:hAnsiTheme="majorHAnsi"/>
-              </w:rPr>
-              <w:t xml:space="preserve"> 서비스 차단</w:t>
+            <w:r>
+              <w:rPr>
+                <w:rFonts w:asciiTheme="majorHAnsi" w:eastAsiaTheme="majorHAnsi" w:hAnsiTheme="majorHAnsi"/>
+              </w:rPr>
+              <w:t>Bootp 서비스 차단</w:t>
             </w:r>
           </w:p>
         </w:tc>
@@ -25109,19 +24739,11 @@
                 <w:rFonts w:asciiTheme="majorHAnsi" w:eastAsiaTheme="majorHAnsi" w:hAnsiTheme="majorHAnsi"/>
               </w:rPr>
             </w:pPr>
-            <w:proofErr w:type="spellStart"/>
-            <w:r>
-              <w:rPr>
-                <w:rFonts w:asciiTheme="majorHAnsi" w:eastAsiaTheme="majorHAnsi" w:hAnsiTheme="majorHAnsi"/>
-              </w:rPr>
-              <w:t>identd</w:t>
-            </w:r>
-            <w:proofErr w:type="spellEnd"/>
-            <w:r>
-              <w:rPr>
-                <w:rFonts w:asciiTheme="majorHAnsi" w:eastAsiaTheme="majorHAnsi" w:hAnsiTheme="majorHAnsi"/>
-              </w:rPr>
-              <w:t xml:space="preserve"> 서비스 차단</w:t>
+            <w:r>
+              <w:rPr>
+                <w:rFonts w:asciiTheme="majorHAnsi" w:eastAsiaTheme="majorHAnsi" w:hAnsiTheme="majorHAnsi"/>
+              </w:rPr>
+              <w:t>identd 서비스 차단</w:t>
             </w:r>
           </w:p>
         </w:tc>
@@ -25623,35 +25245,7 @@
               <w:rPr>
                 <w:rFonts w:asciiTheme="majorHAnsi" w:eastAsiaTheme="majorHAnsi" w:hAnsiTheme="majorHAnsi"/>
               </w:rPr>
-              <w:t xml:space="preserve">제어시스템 계정입력 시 비밀번호 </w:t>
-            </w:r>
-            <w:proofErr w:type="spellStart"/>
-            <w:r>
-              <w:rPr>
-                <w:rFonts w:asciiTheme="majorHAnsi" w:eastAsiaTheme="majorHAnsi" w:hAnsiTheme="majorHAnsi"/>
-              </w:rPr>
-              <w:t>마스킹</w:t>
-            </w:r>
-            <w:proofErr w:type="spellEnd"/>
-            <w:r>
-              <w:rPr>
-                <w:rFonts w:asciiTheme="majorHAnsi" w:eastAsiaTheme="majorHAnsi" w:hAnsiTheme="majorHAnsi"/>
-              </w:rPr>
-              <w:t xml:space="preserve"> 처리, </w:t>
-            </w:r>
-            <w:proofErr w:type="spellStart"/>
-            <w:r>
-              <w:rPr>
-                <w:rFonts w:asciiTheme="majorHAnsi" w:eastAsiaTheme="majorHAnsi" w:hAnsiTheme="majorHAnsi"/>
-              </w:rPr>
-              <w:t>입력값</w:t>
-            </w:r>
-            <w:proofErr w:type="spellEnd"/>
-            <w:r>
-              <w:rPr>
-                <w:rFonts w:asciiTheme="majorHAnsi" w:eastAsiaTheme="majorHAnsi" w:hAnsiTheme="majorHAnsi"/>
-              </w:rPr>
-              <w:t xml:space="preserve"> 에러 발생 시 제공 정보 제한 수행</w:t>
+              <w:t>제어시스템 계정입력 시 비밀번호 마스킹 처리, 입력값 에러 발생 시 제공 정보 제한 수행</w:t>
             </w:r>
           </w:p>
         </w:tc>
@@ -26327,21 +25921,7 @@
               <w:rPr>
                 <w:rFonts w:asciiTheme="majorHAnsi" w:eastAsiaTheme="majorHAnsi" w:hAnsiTheme="majorHAnsi"/>
               </w:rPr>
-              <w:t xml:space="preserve">제어시스템 운영 정보, 제어 명령 등 중요 정보에 대한 </w:t>
-            </w:r>
-            <w:proofErr w:type="spellStart"/>
-            <w:r>
-              <w:rPr>
-                <w:rFonts w:asciiTheme="majorHAnsi" w:eastAsiaTheme="majorHAnsi" w:hAnsiTheme="majorHAnsi"/>
-              </w:rPr>
-              <w:t>위변조</w:t>
-            </w:r>
-            <w:proofErr w:type="spellEnd"/>
-            <w:r>
-              <w:rPr>
-                <w:rFonts w:asciiTheme="majorHAnsi" w:eastAsiaTheme="majorHAnsi" w:hAnsiTheme="majorHAnsi"/>
-              </w:rPr>
-              <w:t xml:space="preserve"> 및 replay 공격 방지 대책 적용</w:t>
+              <w:t>제어시스템 운영 정보, 제어 명령 등 중요 정보에 대한 위변조 및 replay 공격 방지 대책 적용</w:t>
             </w:r>
           </w:p>
         </w:tc>
@@ -26537,35 +26117,7 @@
               <w:rPr>
                 <w:rFonts w:asciiTheme="majorHAnsi" w:eastAsiaTheme="majorHAnsi" w:hAnsiTheme="majorHAnsi"/>
               </w:rPr>
-              <w:t xml:space="preserve">GPS </w:t>
-            </w:r>
-            <w:proofErr w:type="spellStart"/>
-            <w:r>
-              <w:rPr>
-                <w:rFonts w:asciiTheme="majorHAnsi" w:eastAsiaTheme="majorHAnsi" w:hAnsiTheme="majorHAnsi"/>
-              </w:rPr>
-              <w:t>스푸핑</w:t>
-            </w:r>
-            <w:proofErr w:type="spellEnd"/>
-            <w:r>
-              <w:rPr>
-                <w:rFonts w:asciiTheme="majorHAnsi" w:eastAsiaTheme="majorHAnsi" w:hAnsiTheme="majorHAnsi"/>
-              </w:rPr>
-              <w:t>/</w:t>
-            </w:r>
-            <w:proofErr w:type="spellStart"/>
-            <w:r>
-              <w:rPr>
-                <w:rFonts w:asciiTheme="majorHAnsi" w:eastAsiaTheme="majorHAnsi" w:hAnsiTheme="majorHAnsi"/>
-              </w:rPr>
-              <w:t>재밍</w:t>
-            </w:r>
-            <w:proofErr w:type="spellEnd"/>
-            <w:r>
-              <w:rPr>
-                <w:rFonts w:asciiTheme="majorHAnsi" w:eastAsiaTheme="majorHAnsi" w:hAnsiTheme="majorHAnsi"/>
-              </w:rPr>
-              <w:t xml:space="preserve"> 공격 등 시각 동기화 서비스를 교란하기 위한 공격에 대비한 보안 조치 수행</w:t>
+              <w:t>GPS 스푸핑/재밍 공격 등 시각 동기화 서비스를 교란하기 위한 공격에 대비한 보안 조치 수행</w:t>
             </w:r>
           </w:p>
         </w:tc>
@@ -26721,21 +26273,7 @@
               <w:rPr>
                 <w:rFonts w:asciiTheme="majorHAnsi" w:eastAsiaTheme="majorHAnsi" w:hAnsiTheme="majorHAnsi"/>
               </w:rPr>
-              <w:t xml:space="preserve">제어시스템에 대한 최신 업데이트, </w:t>
-            </w:r>
-            <w:proofErr w:type="spellStart"/>
-            <w:r>
-              <w:rPr>
-                <w:rFonts w:asciiTheme="majorHAnsi" w:eastAsiaTheme="majorHAnsi" w:hAnsiTheme="majorHAnsi"/>
-              </w:rPr>
-              <w:t>보안패치를</w:t>
-            </w:r>
-            <w:proofErr w:type="spellEnd"/>
-            <w:r>
-              <w:rPr>
-                <w:rFonts w:asciiTheme="majorHAnsi" w:eastAsiaTheme="majorHAnsi" w:hAnsiTheme="majorHAnsi"/>
-              </w:rPr>
-              <w:t xml:space="preserve"> 안전하게 적용하기 위한 제조사 협력방안, 테스트 방안 등의 절차 수립</w:t>
+              <w:t>제어시스템에 대한 최신 업데이트, 보안패치를 안전하게 적용하기 위한 제조사 협력방안, 테스트 방안 등의 절차 수립</w:t>
             </w:r>
           </w:p>
         </w:tc>
@@ -26800,21 +26338,7 @@
               <w:rPr>
                 <w:rFonts w:asciiTheme="majorHAnsi" w:eastAsiaTheme="majorHAnsi" w:hAnsiTheme="majorHAnsi"/>
               </w:rPr>
-              <w:t xml:space="preserve">외부 업체, 인터넷을 통한 다운로드 등의 경로로 반입된 각종 패치·업데이트 파일에 대해 무결성 검증 및 </w:t>
-            </w:r>
-            <w:proofErr w:type="spellStart"/>
-            <w:r>
-              <w:rPr>
-                <w:rFonts w:asciiTheme="majorHAnsi" w:eastAsiaTheme="majorHAnsi" w:hAnsiTheme="majorHAnsi"/>
-              </w:rPr>
-              <w:t>클린</w:t>
-            </w:r>
-            <w:proofErr w:type="spellEnd"/>
-            <w:r>
-              <w:rPr>
-                <w:rFonts w:asciiTheme="majorHAnsi" w:eastAsiaTheme="majorHAnsi" w:hAnsiTheme="majorHAnsi"/>
-              </w:rPr>
-              <w:t xml:space="preserve"> PC를 통한 악성코드 존재 여부 검사 수행</w:t>
+              <w:t>외부 업체, 인터넷을 통한 다운로드 등의 경로로 반입된 각종 패치·업데이트 파일에 대해 무결성 검증 및 클린 PC를 통한 악성코드 존재 여부 검사 수행</w:t>
             </w:r>
           </w:p>
         </w:tc>
@@ -26879,21 +26403,7 @@
               <w:rPr>
                 <w:rFonts w:asciiTheme="majorHAnsi" w:eastAsiaTheme="majorHAnsi" w:hAnsiTheme="majorHAnsi"/>
               </w:rPr>
-              <w:t xml:space="preserve">제어시스템 구성요소의 알려진 취약점에 대해 </w:t>
-            </w:r>
-            <w:proofErr w:type="spellStart"/>
-            <w:r>
-              <w:rPr>
-                <w:rFonts w:asciiTheme="majorHAnsi" w:eastAsiaTheme="majorHAnsi" w:hAnsiTheme="majorHAnsi"/>
-              </w:rPr>
-              <w:t>보안패치</w:t>
-            </w:r>
-            <w:proofErr w:type="spellEnd"/>
-            <w:r>
-              <w:rPr>
-                <w:rFonts w:asciiTheme="majorHAnsi" w:eastAsiaTheme="majorHAnsi" w:hAnsiTheme="majorHAnsi"/>
-              </w:rPr>
-              <w:t xml:space="preserve"> 적용 또는 상응하는 대응책 적용</w:t>
+              <w:t>제어시스템 구성요소의 알려진 취약점에 대해 보안패치 적용 또는 상응하는 대응책 적용</w:t>
             </w:r>
           </w:p>
         </w:tc>
@@ -27179,21 +26689,7 @@
               <w:rPr>
                 <w:rFonts w:asciiTheme="majorHAnsi" w:eastAsiaTheme="majorHAnsi" w:hAnsiTheme="majorHAnsi"/>
               </w:rPr>
-              <w:t xml:space="preserve">제어 네트워크는 </w:t>
-            </w:r>
-            <w:proofErr w:type="spellStart"/>
-            <w:r>
-              <w:rPr>
-                <w:rFonts w:asciiTheme="majorHAnsi" w:eastAsiaTheme="majorHAnsi" w:hAnsiTheme="majorHAnsi"/>
-              </w:rPr>
-              <w:t>업무망</w:t>
-            </w:r>
-            <w:proofErr w:type="spellEnd"/>
-            <w:r>
-              <w:rPr>
-                <w:rFonts w:asciiTheme="majorHAnsi" w:eastAsiaTheme="majorHAnsi" w:hAnsiTheme="majorHAnsi"/>
-              </w:rPr>
-              <w:t>, 인터넷, CCTV망 등 외부망과 물리적으로 분리하여 사용</w:t>
+              <w:t>제어 네트워크는 업무망, 인터넷, CCTV망 등 외부망과 물리적으로 분리하여 사용</w:t>
             </w:r>
           </w:p>
         </w:tc>
@@ -27258,21 +26754,7 @@
               <w:rPr>
                 <w:rFonts w:asciiTheme="majorHAnsi" w:eastAsiaTheme="majorHAnsi" w:hAnsiTheme="majorHAnsi"/>
               </w:rPr>
-              <w:t xml:space="preserve">제어 네트워크 외부로 자료전달 시 물리적 </w:t>
-            </w:r>
-            <w:proofErr w:type="spellStart"/>
-            <w:r>
-              <w:rPr>
-                <w:rFonts w:asciiTheme="majorHAnsi" w:eastAsiaTheme="majorHAnsi" w:hAnsiTheme="majorHAnsi"/>
-              </w:rPr>
-              <w:t>일방향</w:t>
-            </w:r>
-            <w:proofErr w:type="spellEnd"/>
-            <w:r>
-              <w:rPr>
-                <w:rFonts w:asciiTheme="majorHAnsi" w:eastAsiaTheme="majorHAnsi" w:hAnsiTheme="majorHAnsi"/>
-              </w:rPr>
-              <w:t xml:space="preserve"> 자료전달 환경을 구축하여 외부에서 제어 네트워크로의 침입을 차단</w:t>
+              <w:t>제어 네트워크 외부로 자료전달 시 물리적 일방향 자료전달 환경을 구축하여 외부에서 제어 네트워크로의 침입을 차단</w:t>
             </w:r>
           </w:p>
         </w:tc>
@@ -27337,49 +26819,7 @@
               <w:rPr>
                 <w:rFonts w:asciiTheme="majorHAnsi" w:eastAsiaTheme="majorHAnsi" w:hAnsiTheme="majorHAnsi"/>
               </w:rPr>
-              <w:t xml:space="preserve">제어 네트워크에 무선인터넷, </w:t>
-            </w:r>
-            <w:proofErr w:type="spellStart"/>
-            <w:r>
-              <w:rPr>
-                <w:rFonts w:asciiTheme="majorHAnsi" w:eastAsiaTheme="majorHAnsi" w:hAnsiTheme="majorHAnsi"/>
-              </w:rPr>
-              <w:t>테더링</w:t>
-            </w:r>
-            <w:proofErr w:type="spellEnd"/>
-            <w:r>
-              <w:rPr>
-                <w:rFonts w:asciiTheme="majorHAnsi" w:eastAsiaTheme="majorHAnsi" w:hAnsiTheme="majorHAnsi"/>
-              </w:rPr>
-              <w:t xml:space="preserve">, 외부 </w:t>
-            </w:r>
-            <w:proofErr w:type="spellStart"/>
-            <w:r>
-              <w:rPr>
-                <w:rFonts w:asciiTheme="majorHAnsi" w:eastAsiaTheme="majorHAnsi" w:hAnsiTheme="majorHAnsi"/>
-              </w:rPr>
-              <w:t>유선망</w:t>
-            </w:r>
-            <w:proofErr w:type="spellEnd"/>
-            <w:r>
-              <w:rPr>
-                <w:rFonts w:asciiTheme="majorHAnsi" w:eastAsiaTheme="majorHAnsi" w:hAnsiTheme="majorHAnsi"/>
-              </w:rPr>
-              <w:t xml:space="preserve"> 등의 </w:t>
-            </w:r>
-            <w:proofErr w:type="spellStart"/>
-            <w:r>
-              <w:rPr>
-                <w:rFonts w:asciiTheme="majorHAnsi" w:eastAsiaTheme="majorHAnsi" w:hAnsiTheme="majorHAnsi"/>
-              </w:rPr>
-              <w:t>외부망</w:t>
-            </w:r>
-            <w:proofErr w:type="spellEnd"/>
-            <w:r>
-              <w:rPr>
-                <w:rFonts w:asciiTheme="majorHAnsi" w:eastAsiaTheme="majorHAnsi" w:hAnsiTheme="majorHAnsi"/>
-              </w:rPr>
-              <w:t xml:space="preserve"> 연결을 제한하고 주기적으로 점검</w:t>
+              <w:t>제어 네트워크에 무선인터넷, 테더링, 외부 유선망 등의 외부망 연결을 제한하고 주기적으로 점검</w:t>
             </w:r>
           </w:p>
         </w:tc>
@@ -27444,21 +26884,7 @@
               <w:rPr>
                 <w:rFonts w:asciiTheme="majorHAnsi" w:eastAsiaTheme="majorHAnsi" w:hAnsiTheme="majorHAnsi"/>
               </w:rPr>
-              <w:t xml:space="preserve">제어 네트워크에 </w:t>
-            </w:r>
-            <w:proofErr w:type="spellStart"/>
-            <w:r>
-              <w:rPr>
-                <w:rFonts w:asciiTheme="majorHAnsi" w:eastAsiaTheme="majorHAnsi" w:hAnsiTheme="majorHAnsi"/>
-              </w:rPr>
-              <w:t>비인가된</w:t>
-            </w:r>
-            <w:proofErr w:type="spellEnd"/>
-            <w:r>
-              <w:rPr>
-                <w:rFonts w:asciiTheme="majorHAnsi" w:eastAsiaTheme="majorHAnsi" w:hAnsiTheme="majorHAnsi"/>
-              </w:rPr>
-              <w:t xml:space="preserve"> 시스템/기기에 대한 연결 및 접속을 차단</w:t>
+              <w:t>제어 네트워크에 비인가된 시스템/기기에 대한 연결 및 접속을 차단</w:t>
             </w:r>
           </w:p>
         </w:tc>
@@ -27523,21 +26949,7 @@
               <w:rPr>
                 <w:rFonts w:asciiTheme="majorHAnsi" w:eastAsiaTheme="majorHAnsi" w:hAnsiTheme="majorHAnsi"/>
               </w:rPr>
-              <w:t xml:space="preserve">물리적 </w:t>
-            </w:r>
-            <w:proofErr w:type="spellStart"/>
-            <w:r>
-              <w:rPr>
-                <w:rFonts w:asciiTheme="majorHAnsi" w:eastAsiaTheme="majorHAnsi" w:hAnsiTheme="majorHAnsi"/>
-              </w:rPr>
-              <w:t>일방향</w:t>
-            </w:r>
-            <w:proofErr w:type="spellEnd"/>
-            <w:r>
-              <w:rPr>
-                <w:rFonts w:asciiTheme="majorHAnsi" w:eastAsiaTheme="majorHAnsi" w:hAnsiTheme="majorHAnsi"/>
-              </w:rPr>
-              <w:t xml:space="preserve"> 자료전달 환경의 올바른 동작 및 운용에 대한 주기적인 점검 수행</w:t>
+              <w:t>물리적 일방향 자료전달 환경의 올바른 동작 및 운용에 대한 주기적인 점검 수행</w:t>
             </w:r>
           </w:p>
         </w:tc>
@@ -27759,21 +27171,7 @@
               <w:rPr>
                 <w:rFonts w:asciiTheme="majorHAnsi" w:eastAsiaTheme="majorHAnsi" w:hAnsiTheme="majorHAnsi"/>
               </w:rPr>
-              <w:t xml:space="preserve">제어시스템에 대해 네트워크 포트, USB 포트 등 외부 연결 접점에 대해 </w:t>
-            </w:r>
-            <w:proofErr w:type="spellStart"/>
-            <w:r>
-              <w:rPr>
-                <w:rFonts w:asciiTheme="majorHAnsi" w:eastAsiaTheme="majorHAnsi" w:hAnsiTheme="majorHAnsi"/>
-              </w:rPr>
-              <w:t>허가받은</w:t>
-            </w:r>
-            <w:proofErr w:type="spellEnd"/>
-            <w:r>
-              <w:rPr>
-                <w:rFonts w:asciiTheme="majorHAnsi" w:eastAsiaTheme="majorHAnsi" w:hAnsiTheme="majorHAnsi"/>
-              </w:rPr>
-              <w:t xml:space="preserve"> 사항을 제외하고 모두 물리적 또는 논리적으로 차단</w:t>
+              <w:t>제어시스템에 대해 네트워크 포트, USB 포트 등 외부 연결 접점에 대해 허가받은 사항을 제외하고 모두 물리적 또는 논리적으로 차단</w:t>
             </w:r>
           </w:p>
         </w:tc>
@@ -27838,49 +27236,7 @@
               <w:rPr>
                 <w:rFonts w:asciiTheme="majorHAnsi" w:eastAsiaTheme="majorHAnsi" w:hAnsiTheme="majorHAnsi"/>
               </w:rPr>
-              <w:t>제어시스템 구성요소를 물리적으로 보호할 수 있는 조치 적용(</w:t>
-            </w:r>
-            <w:proofErr w:type="spellStart"/>
-            <w:r>
-              <w:rPr>
-                <w:rFonts w:asciiTheme="majorHAnsi" w:eastAsiaTheme="majorHAnsi" w:hAnsiTheme="majorHAnsi"/>
-              </w:rPr>
-              <w:t>잠금장치가</w:t>
-            </w:r>
-            <w:proofErr w:type="spellEnd"/>
-            <w:r>
-              <w:rPr>
-                <w:rFonts w:asciiTheme="majorHAnsi" w:eastAsiaTheme="majorHAnsi" w:hAnsiTheme="majorHAnsi"/>
-              </w:rPr>
-              <w:t xml:space="preserve"> 있는 </w:t>
-            </w:r>
-            <w:proofErr w:type="spellStart"/>
-            <w:r>
-              <w:rPr>
-                <w:rFonts w:asciiTheme="majorHAnsi" w:eastAsiaTheme="majorHAnsi" w:hAnsiTheme="majorHAnsi"/>
-              </w:rPr>
-              <w:t>함체</w:t>
-            </w:r>
-            <w:proofErr w:type="spellEnd"/>
-            <w:r>
-              <w:rPr>
-                <w:rFonts w:asciiTheme="majorHAnsi" w:eastAsiaTheme="majorHAnsi" w:hAnsiTheme="majorHAnsi"/>
-              </w:rPr>
-              <w:t xml:space="preserve">, </w:t>
-            </w:r>
-            <w:proofErr w:type="spellStart"/>
-            <w:r>
-              <w:rPr>
-                <w:rFonts w:asciiTheme="majorHAnsi" w:eastAsiaTheme="majorHAnsi" w:hAnsiTheme="majorHAnsi"/>
-              </w:rPr>
-              <w:t>랙</w:t>
-            </w:r>
-            <w:proofErr w:type="spellEnd"/>
-            <w:r>
-              <w:rPr>
-                <w:rFonts w:asciiTheme="majorHAnsi" w:eastAsiaTheme="majorHAnsi" w:hAnsiTheme="majorHAnsi"/>
-              </w:rPr>
-              <w:t>, 수납 책상 등)</w:t>
+              <w:t>제어시스템 구성요소를 물리적으로 보호할 수 있는 조치 적용(잠금장치가 있는 함체, 랙, 수납 책상 등)</w:t>
             </w:r>
           </w:p>
         </w:tc>
@@ -29033,6 +28389,7 @@
         <w:pStyle w:val="a"/>
       </w:pPr>
       <w:r>
+        <w:lastRenderedPageBreak/>
         <w:t>8. 보안 관리</w:t>
       </w:r>
     </w:p>
@@ -29266,21 +28623,7 @@
               <w:rPr>
                 <w:rFonts w:asciiTheme="majorHAnsi" w:eastAsiaTheme="majorHAnsi" w:hAnsiTheme="majorHAnsi"/>
               </w:rPr>
-              <w:t xml:space="preserve">제어시스템에서 USB 등 이동형 저장 매체를 사용해야 하는 경우, </w:t>
-            </w:r>
-            <w:proofErr w:type="spellStart"/>
-            <w:r>
-              <w:rPr>
-                <w:rFonts w:asciiTheme="majorHAnsi" w:eastAsiaTheme="majorHAnsi" w:hAnsiTheme="majorHAnsi"/>
-              </w:rPr>
-              <w:t>사전정의된</w:t>
-            </w:r>
-            <w:proofErr w:type="spellEnd"/>
-            <w:r>
-              <w:rPr>
-                <w:rFonts w:asciiTheme="majorHAnsi" w:eastAsiaTheme="majorHAnsi" w:hAnsiTheme="majorHAnsi"/>
-              </w:rPr>
-              <w:t xml:space="preserve"> 정책에 따라 사용</w:t>
+              <w:t>제어시스템에서 USB 등 이동형 저장 매체를 사용해야 하는 경우, 사전정의된 정책에 따라 사용</w:t>
             </w:r>
           </w:p>
         </w:tc>
@@ -29345,35 +28688,7 @@
               <w:rPr>
                 <w:rFonts w:asciiTheme="majorHAnsi" w:eastAsiaTheme="majorHAnsi" w:hAnsiTheme="majorHAnsi"/>
               </w:rPr>
-              <w:t xml:space="preserve">제어 네트워크에 연결되는 외부 정보통신기기 </w:t>
-            </w:r>
-            <w:proofErr w:type="spellStart"/>
-            <w:r>
-              <w:rPr>
-                <w:rFonts w:asciiTheme="majorHAnsi" w:eastAsiaTheme="majorHAnsi" w:hAnsiTheme="majorHAnsi"/>
-              </w:rPr>
-              <w:t>반출입</w:t>
-            </w:r>
-            <w:proofErr w:type="spellEnd"/>
-            <w:r>
-              <w:rPr>
-                <w:rFonts w:asciiTheme="majorHAnsi" w:eastAsiaTheme="majorHAnsi" w:hAnsiTheme="majorHAnsi"/>
-              </w:rPr>
-              <w:t xml:space="preserve"> 시 </w:t>
-            </w:r>
-            <w:proofErr w:type="spellStart"/>
-            <w:r>
-              <w:rPr>
-                <w:rFonts w:asciiTheme="majorHAnsi" w:eastAsiaTheme="majorHAnsi" w:hAnsiTheme="majorHAnsi"/>
-              </w:rPr>
-              <w:t>클린존</w:t>
-            </w:r>
-            <w:proofErr w:type="spellEnd"/>
-            <w:r>
-              <w:rPr>
-                <w:rFonts w:asciiTheme="majorHAnsi" w:eastAsiaTheme="majorHAnsi" w:hAnsiTheme="majorHAnsi"/>
-              </w:rPr>
-              <w:t xml:space="preserve"> 통과, 관리대장 작성 등 관리절차 마련</w:t>
+              <w:t>제어 네트워크에 연결되는 외부 정보통신기기 반출입 시 클린존 통과, 관리대장 작성 등 관리절차 마련</w:t>
             </w:r>
           </w:p>
         </w:tc>
@@ -29789,21 +29104,7 @@
               <w:rPr>
                 <w:rFonts w:asciiTheme="majorHAnsi" w:eastAsiaTheme="majorHAnsi" w:hAnsiTheme="majorHAnsi"/>
               </w:rPr>
-              <w:t xml:space="preserve">제어시스템 </w:t>
-            </w:r>
-            <w:proofErr w:type="spellStart"/>
-            <w:r>
-              <w:rPr>
-                <w:rFonts w:asciiTheme="majorHAnsi" w:eastAsiaTheme="majorHAnsi" w:hAnsiTheme="majorHAnsi"/>
-              </w:rPr>
-              <w:t>운전원</w:t>
-            </w:r>
-            <w:proofErr w:type="spellEnd"/>
-            <w:r>
-              <w:rPr>
-                <w:rFonts w:asciiTheme="majorHAnsi" w:eastAsiaTheme="majorHAnsi" w:hAnsiTheme="majorHAnsi"/>
-              </w:rPr>
-              <w:t>, 관리자, 유지보수인력, 보안 인력에 대해 직무별 직무교육을 정기적으로 실시</w:t>
+              <w:t>제어시스템 운전원, 관리자, 유지보수인력, 보안 인력에 대해 직무별 직무교육을 정기적으로 실시</w:t>
             </w:r>
           </w:p>
         </w:tc>
@@ -30593,6 +29894,7 @@
               <w:rPr>
                 <w:rFonts w:asciiTheme="majorHAnsi" w:eastAsiaTheme="majorHAnsi" w:hAnsiTheme="majorHAnsi"/>
               </w:rPr>
+              <w:lastRenderedPageBreak/>
               <w:t>브라우저 종료 시 임시 인터넷 파일 폴더의 내용을 삭제하도록 설정</w:t>
             </w:r>
           </w:p>
@@ -31596,21 +30898,7 @@
               <w:rPr>
                 <w:rFonts w:asciiTheme="majorHAnsi" w:eastAsiaTheme="majorHAnsi" w:hAnsiTheme="majorHAnsi"/>
               </w:rPr>
-              <w:t xml:space="preserve">데이터베이스의 불필요 계정을 제거하거나, </w:t>
-            </w:r>
-            <w:proofErr w:type="spellStart"/>
-            <w:r>
-              <w:rPr>
-                <w:rFonts w:asciiTheme="majorHAnsi" w:eastAsiaTheme="majorHAnsi" w:hAnsiTheme="majorHAnsi"/>
-              </w:rPr>
-              <w:t>잠금설정</w:t>
-            </w:r>
-            <w:proofErr w:type="spellEnd"/>
-            <w:r>
-              <w:rPr>
-                <w:rFonts w:asciiTheme="majorHAnsi" w:eastAsiaTheme="majorHAnsi" w:hAnsiTheme="majorHAnsi"/>
-              </w:rPr>
-              <w:t xml:space="preserve"> 후 사용</w:t>
+              <w:t>데이터베이스의 불필요 계정을 제거하거나, 잠금설정 후 사용</w:t>
             </w:r>
           </w:p>
         </w:tc>
@@ -32065,21 +31353,7 @@
               <w:rPr>
                 <w:rFonts w:asciiTheme="majorHAnsi" w:eastAsiaTheme="majorHAnsi" w:hAnsiTheme="majorHAnsi"/>
               </w:rPr>
-              <w:t xml:space="preserve">일정 횟수의 로그인 실패 시 이에 대한 </w:t>
-            </w:r>
-            <w:proofErr w:type="spellStart"/>
-            <w:r>
-              <w:rPr>
-                <w:rFonts w:asciiTheme="majorHAnsi" w:eastAsiaTheme="majorHAnsi" w:hAnsiTheme="majorHAnsi"/>
-              </w:rPr>
-              <w:t>잠금정책</w:t>
-            </w:r>
-            <w:proofErr w:type="spellEnd"/>
-            <w:r>
-              <w:rPr>
-                <w:rFonts w:asciiTheme="majorHAnsi" w:eastAsiaTheme="majorHAnsi" w:hAnsiTheme="majorHAnsi"/>
-              </w:rPr>
-              <w:t xml:space="preserve"> 설정</w:t>
+              <w:t>일정 횟수의 로그인 실패 시 이에 대한 잠금정책 설정</w:t>
             </w:r>
           </w:p>
         </w:tc>
@@ -32366,21 +31640,7 @@
               <w:rPr>
                 <w:rFonts w:asciiTheme="majorHAnsi" w:eastAsiaTheme="majorHAnsi" w:hAnsiTheme="majorHAnsi"/>
               </w:rPr>
-              <w:t xml:space="preserve">안전한 </w:t>
-            </w:r>
-            <w:proofErr w:type="spellStart"/>
-            <w:r>
-              <w:rPr>
-                <w:rFonts w:asciiTheme="majorHAnsi" w:eastAsiaTheme="majorHAnsi" w:hAnsiTheme="majorHAnsi"/>
-              </w:rPr>
-              <w:t>리스너</w:t>
-            </w:r>
-            <w:proofErr w:type="spellEnd"/>
-            <w:r>
-              <w:rPr>
-                <w:rFonts w:asciiTheme="majorHAnsi" w:eastAsiaTheme="majorHAnsi" w:hAnsiTheme="majorHAnsi"/>
-              </w:rPr>
-              <w:t xml:space="preserve"> 비밀번호 설정 및 사용</w:t>
+              <w:t>안전한 리스너 비밀번호 설정 및 사용</w:t>
             </w:r>
           </w:p>
         </w:tc>
@@ -32575,35 +31835,7 @@
               <w:rPr>
                 <w:rFonts w:asciiTheme="majorHAnsi" w:eastAsiaTheme="majorHAnsi" w:hAnsiTheme="majorHAnsi"/>
               </w:rPr>
-              <w:t xml:space="preserve">관리자 이외의 사용자가 오라클 </w:t>
-            </w:r>
-            <w:proofErr w:type="spellStart"/>
-            <w:r>
-              <w:rPr>
-                <w:rFonts w:asciiTheme="majorHAnsi" w:eastAsiaTheme="majorHAnsi" w:hAnsiTheme="majorHAnsi"/>
-              </w:rPr>
-              <w:t>리스너의</w:t>
-            </w:r>
-            <w:proofErr w:type="spellEnd"/>
-            <w:r>
-              <w:rPr>
-                <w:rFonts w:asciiTheme="majorHAnsi" w:eastAsiaTheme="majorHAnsi" w:hAnsiTheme="majorHAnsi"/>
-              </w:rPr>
-              <w:t xml:space="preserve"> 접속을 통해 </w:t>
-            </w:r>
-            <w:proofErr w:type="spellStart"/>
-            <w:r>
-              <w:rPr>
-                <w:rFonts w:asciiTheme="majorHAnsi" w:eastAsiaTheme="majorHAnsi" w:hAnsiTheme="majorHAnsi"/>
-              </w:rPr>
-              <w:t>리스너</w:t>
-            </w:r>
-            <w:proofErr w:type="spellEnd"/>
-            <w:r>
-              <w:rPr>
-                <w:rFonts w:asciiTheme="majorHAnsi" w:eastAsiaTheme="majorHAnsi" w:hAnsiTheme="majorHAnsi"/>
-              </w:rPr>
-              <w:t xml:space="preserve"> 로그 및 trace 파일에 대한 변경 제한</w:t>
+              <w:t>관리자 이외의 사용자가 오라클 리스너의 접속을 통해 리스너 로그 및 trace 파일에 대한 변경 제한</w:t>
             </w:r>
           </w:p>
         </w:tc>
@@ -33210,19 +32442,11 @@
                 <w:rFonts w:asciiTheme="majorHAnsi" w:eastAsiaTheme="majorHAnsi" w:hAnsiTheme="majorHAnsi"/>
               </w:rPr>
             </w:pPr>
-            <w:proofErr w:type="spellStart"/>
-            <w:r>
-              <w:rPr>
-                <w:rFonts w:asciiTheme="majorHAnsi" w:eastAsiaTheme="majorHAnsi" w:hAnsiTheme="majorHAnsi"/>
-              </w:rPr>
-              <w:t>xp_cmdshell</w:t>
-            </w:r>
-            <w:proofErr w:type="spellEnd"/>
-            <w:r>
-              <w:rPr>
-                <w:rFonts w:asciiTheme="majorHAnsi" w:eastAsiaTheme="majorHAnsi" w:hAnsiTheme="majorHAnsi"/>
-              </w:rPr>
-              <w:t xml:space="preserve"> 사용 제한</w:t>
+            <w:r>
+              <w:rPr>
+                <w:rFonts w:asciiTheme="majorHAnsi" w:eastAsiaTheme="majorHAnsi" w:hAnsiTheme="majorHAnsi"/>
+              </w:rPr>
+              <w:t>xp_cmdshell 사용 제한</w:t>
             </w:r>
           </w:p>
         </w:tc>
@@ -33685,21 +32909,7 @@
               <w:rPr>
                 <w:rFonts w:asciiTheme="majorHAnsi" w:eastAsiaTheme="majorHAnsi" w:hAnsiTheme="majorHAnsi"/>
               </w:rPr>
-              <w:t xml:space="preserve">이동통신망 </w:t>
-            </w:r>
-            <w:proofErr w:type="spellStart"/>
-            <w:r>
-              <w:rPr>
-                <w:rFonts w:asciiTheme="majorHAnsi" w:eastAsiaTheme="majorHAnsi" w:hAnsiTheme="majorHAnsi"/>
-              </w:rPr>
-              <w:t>엣지</w:t>
-            </w:r>
-            <w:proofErr w:type="spellEnd"/>
-            <w:r>
-              <w:rPr>
-                <w:rFonts w:asciiTheme="majorHAnsi" w:eastAsiaTheme="majorHAnsi" w:hAnsiTheme="majorHAnsi"/>
-              </w:rPr>
-              <w:t xml:space="preserve"> 네트워크 운영 시 인터넷 연결 등을 고려한 보안기술을 적용</w:t>
+              <w:t>이동통신망 엣지 네트워크 운영 시 인터넷 연결 등을 고려한 보안기술을 적용</w:t>
             </w:r>
           </w:p>
         </w:tc>
@@ -34075,21 +33285,7 @@
               <w:rPr>
                 <w:rFonts w:asciiTheme="majorHAnsi" w:eastAsiaTheme="majorHAnsi" w:hAnsiTheme="majorHAnsi"/>
               </w:rPr>
-              <w:t xml:space="preserve">코드 </w:t>
-            </w:r>
-            <w:proofErr w:type="spellStart"/>
-            <w:r>
-              <w:rPr>
-                <w:rFonts w:asciiTheme="majorHAnsi" w:eastAsiaTheme="majorHAnsi" w:hAnsiTheme="majorHAnsi"/>
-              </w:rPr>
-              <w:t>인젝션</w:t>
-            </w:r>
-            <w:proofErr w:type="spellEnd"/>
-            <w:r>
-              <w:rPr>
-                <w:rFonts w:asciiTheme="majorHAnsi" w:eastAsiaTheme="majorHAnsi" w:hAnsiTheme="majorHAnsi"/>
-              </w:rPr>
-              <w:t xml:space="preserve"> (Code Injection)</w:t>
+              <w:t>코드 인젝션 (Code Injection)</w:t>
             </w:r>
           </w:p>
         </w:tc>
@@ -34154,21 +33350,7 @@
               <w:rPr>
                 <w:rFonts w:asciiTheme="majorHAnsi" w:eastAsiaTheme="majorHAnsi" w:hAnsiTheme="majorHAnsi"/>
               </w:rPr>
-              <w:t xml:space="preserve">SQL </w:t>
-            </w:r>
-            <w:proofErr w:type="spellStart"/>
-            <w:r>
-              <w:rPr>
-                <w:rFonts w:asciiTheme="majorHAnsi" w:eastAsiaTheme="majorHAnsi" w:hAnsiTheme="majorHAnsi"/>
-              </w:rPr>
-              <w:t>인젝션</w:t>
-            </w:r>
-            <w:proofErr w:type="spellEnd"/>
-            <w:r>
-              <w:rPr>
-                <w:rFonts w:asciiTheme="majorHAnsi" w:eastAsiaTheme="majorHAnsi" w:hAnsiTheme="majorHAnsi"/>
-              </w:rPr>
-              <w:t xml:space="preserve"> (SQL Injection)</w:t>
+              <w:t>SQL 인젝션 (SQL Injection)</w:t>
             </w:r>
           </w:p>
         </w:tc>
@@ -35143,21 +34325,7 @@
               <w:rPr>
                 <w:rFonts w:asciiTheme="majorHAnsi" w:eastAsiaTheme="majorHAnsi" w:hAnsiTheme="majorHAnsi"/>
               </w:rPr>
-              <w:t xml:space="preserve">데이터 </w:t>
-            </w:r>
-            <w:proofErr w:type="spellStart"/>
-            <w:r>
-              <w:rPr>
-                <w:rFonts w:asciiTheme="majorHAnsi" w:eastAsiaTheme="majorHAnsi" w:hAnsiTheme="majorHAnsi"/>
-              </w:rPr>
-              <w:t>평문</w:t>
-            </w:r>
-            <w:proofErr w:type="spellEnd"/>
-            <w:r>
-              <w:rPr>
-                <w:rFonts w:asciiTheme="majorHAnsi" w:eastAsiaTheme="majorHAnsi" w:hAnsiTheme="majorHAnsi"/>
-              </w:rPr>
-              <w:t xml:space="preserve"> 전송</w:t>
+              <w:t>데이터 평문 전송</w:t>
             </w:r>
           </w:p>
         </w:tc>
@@ -35997,21 +35165,7 @@
               <w:rPr>
                 <w:rFonts w:asciiTheme="majorHAnsi" w:eastAsiaTheme="majorHAnsi" w:hAnsiTheme="majorHAnsi"/>
               </w:rPr>
-              <w:t xml:space="preserve">계정 잠금 </w:t>
-            </w:r>
-            <w:proofErr w:type="spellStart"/>
-            <w:r>
-              <w:rPr>
-                <w:rFonts w:asciiTheme="majorHAnsi" w:eastAsiaTheme="majorHAnsi" w:hAnsiTheme="majorHAnsi"/>
-              </w:rPr>
-              <w:t>임계값</w:t>
-            </w:r>
-            <w:proofErr w:type="spellEnd"/>
-            <w:r>
-              <w:rPr>
-                <w:rFonts w:asciiTheme="majorHAnsi" w:eastAsiaTheme="majorHAnsi" w:hAnsiTheme="majorHAnsi"/>
-              </w:rPr>
-              <w:t xml:space="preserve"> 설정</w:t>
+              <w:t>계정 잠금 임계값 설정</w:t>
             </w:r>
           </w:p>
         </w:tc>
@@ -36423,19 +35577,11 @@
                 <w:rFonts w:asciiTheme="majorHAnsi" w:eastAsiaTheme="majorHAnsi" w:hAnsiTheme="majorHAnsi"/>
               </w:rPr>
             </w:pPr>
-            <w:proofErr w:type="spellStart"/>
-            <w:r>
-              <w:rPr>
-                <w:rFonts w:asciiTheme="majorHAnsi" w:eastAsiaTheme="majorHAnsi" w:hAnsiTheme="majorHAnsi"/>
-              </w:rPr>
-              <w:t>ESXi</w:t>
-            </w:r>
-            <w:proofErr w:type="spellEnd"/>
-            <w:r>
-              <w:rPr>
-                <w:rFonts w:asciiTheme="majorHAnsi" w:eastAsiaTheme="majorHAnsi" w:hAnsiTheme="majorHAnsi"/>
-              </w:rPr>
-              <w:t xml:space="preserve"> Shell 비활성화</w:t>
+            <w:r>
+              <w:rPr>
+                <w:rFonts w:asciiTheme="majorHAnsi" w:eastAsiaTheme="majorHAnsi" w:hAnsiTheme="majorHAnsi"/>
+              </w:rPr>
+              <w:t>ESXi Shell 비활성화</w:t>
             </w:r>
           </w:p>
         </w:tc>
@@ -36496,19 +35642,11 @@
                 <w:rFonts w:asciiTheme="majorHAnsi" w:eastAsiaTheme="majorHAnsi" w:hAnsiTheme="majorHAnsi"/>
               </w:rPr>
             </w:pPr>
-            <w:proofErr w:type="spellStart"/>
-            <w:r>
-              <w:rPr>
-                <w:rFonts w:asciiTheme="majorHAnsi" w:eastAsiaTheme="majorHAnsi" w:hAnsiTheme="majorHAnsi"/>
-              </w:rPr>
-              <w:t>ESXi</w:t>
-            </w:r>
-            <w:proofErr w:type="spellEnd"/>
-            <w:r>
-              <w:rPr>
-                <w:rFonts w:asciiTheme="majorHAnsi" w:eastAsiaTheme="majorHAnsi" w:hAnsiTheme="majorHAnsi"/>
-              </w:rPr>
-              <w:t xml:space="preserve"> Shell 세션 종료 시간 설정</w:t>
+            <w:r>
+              <w:rPr>
+                <w:rFonts w:asciiTheme="majorHAnsi" w:eastAsiaTheme="majorHAnsi" w:hAnsiTheme="majorHAnsi"/>
+              </w:rPr>
+              <w:t>ESXi Shell 세션 종료 시간 설정</w:t>
             </w:r>
           </w:p>
         </w:tc>
@@ -36855,19 +35993,11 @@
                 <w:rFonts w:asciiTheme="majorHAnsi" w:eastAsiaTheme="majorHAnsi" w:hAnsiTheme="majorHAnsi"/>
               </w:rPr>
             </w:pPr>
-            <w:proofErr w:type="spellStart"/>
-            <w:r>
-              <w:rPr>
-                <w:rFonts w:asciiTheme="majorHAnsi" w:eastAsiaTheme="majorHAnsi" w:hAnsiTheme="majorHAnsi"/>
-              </w:rPr>
-              <w:t>코어덤프</w:t>
-            </w:r>
-            <w:proofErr w:type="spellEnd"/>
-            <w:r>
-              <w:rPr>
-                <w:rFonts w:asciiTheme="majorHAnsi" w:eastAsiaTheme="majorHAnsi" w:hAnsiTheme="majorHAnsi"/>
-              </w:rPr>
-              <w:t xml:space="preserve"> 수집 기능 활성화</w:t>
+            <w:r>
+              <w:rPr>
+                <w:rFonts w:asciiTheme="majorHAnsi" w:eastAsiaTheme="majorHAnsi" w:hAnsiTheme="majorHAnsi"/>
+              </w:rPr>
+              <w:t>코어덤프 수집 기능 활성화</w:t>
             </w:r>
           </w:p>
         </w:tc>
@@ -36932,21 +36062,7 @@
               <w:rPr>
                 <w:rFonts w:asciiTheme="majorHAnsi" w:eastAsiaTheme="majorHAnsi" w:hAnsiTheme="majorHAnsi"/>
               </w:rPr>
-              <w:t xml:space="preserve">가상 </w:t>
-            </w:r>
-            <w:proofErr w:type="spellStart"/>
-            <w:r>
-              <w:rPr>
-                <w:rFonts w:asciiTheme="majorHAnsi" w:eastAsiaTheme="majorHAnsi" w:hAnsiTheme="majorHAnsi"/>
-              </w:rPr>
-              <w:t>머신의</w:t>
-            </w:r>
-            <w:proofErr w:type="spellEnd"/>
-            <w:r>
-              <w:rPr>
-                <w:rFonts w:asciiTheme="majorHAnsi" w:eastAsiaTheme="majorHAnsi" w:hAnsiTheme="majorHAnsi"/>
-              </w:rPr>
-              <w:t xml:space="preserve"> 장치 변경 제한 설정</w:t>
+              <w:t>가상 머신의 장치 변경 제한 설정</w:t>
             </w:r>
           </w:p>
         </w:tc>
@@ -37011,21 +36127,7 @@
               <w:rPr>
                 <w:rFonts w:asciiTheme="majorHAnsi" w:eastAsiaTheme="majorHAnsi" w:hAnsiTheme="majorHAnsi"/>
               </w:rPr>
-              <w:t xml:space="preserve">가상 </w:t>
-            </w:r>
-            <w:proofErr w:type="spellStart"/>
-            <w:r>
-              <w:rPr>
-                <w:rFonts w:asciiTheme="majorHAnsi" w:eastAsiaTheme="majorHAnsi" w:hAnsiTheme="majorHAnsi"/>
-              </w:rPr>
-              <w:t>머신의</w:t>
-            </w:r>
-            <w:proofErr w:type="spellEnd"/>
-            <w:r>
-              <w:rPr>
-                <w:rFonts w:asciiTheme="majorHAnsi" w:eastAsiaTheme="majorHAnsi" w:hAnsiTheme="majorHAnsi"/>
-              </w:rPr>
-              <w:t xml:space="preserve"> 불필요한 장치 제거</w:t>
+              <w:t>가상 머신의 불필요한 장치 제거</w:t>
             </w:r>
           </w:p>
         </w:tc>
@@ -38256,21 +37358,7 @@
               <w:rPr>
                 <w:rFonts w:asciiTheme="majorHAnsi" w:eastAsiaTheme="majorHAnsi" w:hAnsiTheme="majorHAnsi"/>
               </w:rPr>
-              <w:t xml:space="preserve">VPC 네트워크 </w:t>
-            </w:r>
-            <w:proofErr w:type="spellStart"/>
-            <w:r>
-              <w:rPr>
-                <w:rFonts w:asciiTheme="majorHAnsi" w:eastAsiaTheme="majorHAnsi" w:hAnsiTheme="majorHAnsi"/>
-              </w:rPr>
-              <w:t>서브넷</w:t>
-            </w:r>
-            <w:proofErr w:type="spellEnd"/>
-            <w:r>
-              <w:rPr>
-                <w:rFonts w:asciiTheme="majorHAnsi" w:eastAsiaTheme="majorHAnsi" w:hAnsiTheme="majorHAnsi"/>
-              </w:rPr>
-              <w:t xml:space="preserve"> 관리</w:t>
+              <w:t>VPC 네트워크 서브넷 관리</w:t>
             </w:r>
           </w:p>
         </w:tc>
@@ -39234,15 +38322,7 @@
         <w:pStyle w:val="a"/>
       </w:pPr>
       <w:r>
-        <w:t xml:space="preserve">본 </w:t>
-      </w:r>
-      <w:proofErr w:type="spellStart"/>
-      <w:r>
-        <w:t>모의해킹을</w:t>
-      </w:r>
-      <w:proofErr w:type="spellEnd"/>
-      <w:r>
-        <w:t xml:space="preserve"> 수행하면서 사용된 도구는 아래 표와 같다.</w:t>
+        <w:t>본 모의해킹을 수행하면서 사용된 도구는 아래 표와 같다.</w:t>
       </w:r>
     </w:p>
     <w:tbl>
@@ -39339,11 +38419,9 @@
             <w:pPr>
               <w:pStyle w:val="a9"/>
             </w:pPr>
-            <w:proofErr w:type="spellStart"/>
             <w:r>
               <w:t>BurpSuite</w:t>
             </w:r>
-            <w:proofErr w:type="spellEnd"/>
           </w:p>
         </w:tc>
         <w:tc>
@@ -39410,16 +38488,16 @@
           <w:numId w:val="3"/>
         </w:numPr>
       </w:pPr>
-      <w:bookmarkStart w:id="1" w:name="_Toc55044876"/>
-      <w:bookmarkStart w:id="2" w:name="_Toc55046361"/>
+      <w:bookmarkStart w:id="3" w:name="_Toc55044876"/>
+      <w:bookmarkStart w:id="4" w:name="_Toc234421310"/>
       <w:r>
         <w:rPr>
           <w:rFonts w:hint="eastAsia"/>
         </w:rPr>
         <w:t>결과 요약</w:t>
       </w:r>
-      <w:bookmarkEnd w:id="1"/>
-      <w:bookmarkEnd w:id="2"/>
+      <w:bookmarkEnd w:id="3"/>
+      <w:bookmarkEnd w:id="4"/>
     </w:p>
     <w:p>
       <w:pPr>
@@ -39541,7 +38619,8 @@
         </w:numPr>
         <w:ind w:left="403" w:hanging="403"/>
       </w:pPr>
-      <w:bookmarkStart w:id="3" w:name="_Toc55046368"/>
+      <w:bookmarkStart w:id="5" w:name="_Toc55046368"/>
+      <w:bookmarkStart w:id="6" w:name="_Toc234421311"/>
       <w:r>
         <w:rPr>
           <w:rFonts w:hint="eastAsia"/>
@@ -39557,7 +38636,8 @@
         </w:rPr>
         <w:t>상세 수행 내역</w:t>
       </w:r>
-      <w:bookmarkEnd w:id="3"/>
+      <w:bookmarkEnd w:id="5"/>
+      <w:bookmarkEnd w:id="6"/>
     </w:p>
     <w:p>
       <w:pPr>
@@ -39682,21 +38762,7 @@
         <w:rPr>
           <w:rFonts w:hint="eastAsia"/>
         </w:rPr>
-        <w:t xml:space="preserve">시나리오 기반 </w:t>
-      </w:r>
-      <w:proofErr w:type="spellStart"/>
-      <w:r>
-        <w:rPr>
-          <w:rFonts w:hint="eastAsia"/>
-        </w:rPr>
-        <w:t>모의해킹</w:t>
-      </w:r>
-      <w:proofErr w:type="spellEnd"/>
-      <w:r>
-        <w:rPr>
-          <w:rFonts w:hint="eastAsia"/>
-        </w:rPr>
-        <w:t xml:space="preserve"> 및 위험 분석</w:t>
+        <w:t>시나리오 기반 모의해킹 및 위험 분석</w:t>
       </w:r>
     </w:p>
     <w:p>
@@ -39742,14 +38808,12 @@
         </w:rPr>
         <w:t xml:space="preserve"> </w:t>
       </w:r>
-      <w:proofErr w:type="spellStart"/>
       <w:r>
         <w:rPr>
           <w:rFonts w:hint="eastAsia"/>
         </w:rPr>
         <w:t>모의해킹</w:t>
       </w:r>
-      <w:proofErr w:type="spellEnd"/>
       <w:r>
         <w:rPr>
           <w:rFonts w:hint="eastAsia"/>
@@ -39899,7 +38963,7 @@
 </file>
 
 <file path=word/endnotes.xml><?xml version="1.0" encoding="utf-8"?>
-<w:endnotes xmlns:wpc="http://schemas.microsoft.com/office/word/2010/wordprocessingCanvas" xmlns:cx="http://schemas.microsoft.com/office/drawing/2014/chartex" xmlns:cx1="http://schemas.microsoft.com/office/drawing/2015/9/8/chartex" xmlns:cx2="http://schemas.microsoft.com/office/drawing/2015/10/21/chartex" xmlns:cx3="http://schemas.microsoft.com/office/drawing/2016/5/9/chartex" xmlns:cx4="http://schemas.microsoft.com/office/drawing/2016/5/10/chartex" xmlns:cx5="http://schemas.microsoft.com/office/drawing/2016/5/11/chartex" xmlns:cx6="http://schemas.microsoft.com/office/drawing/2016/5/12/chartex" xmlns:cx7="http://schemas.microsoft.com/office/drawing/2016/5/13/chartex" xmlns:cx8="http://schemas.microsoft.com/office/drawing/2016/5/14/chartex" xmlns:mc="http://schemas.openxmlformats.org/markup-compatibility/2006" xmlns:aink="http://schemas.microsoft.com/office/drawing/2016/ink" xmlns:am3d="http://schemas.microsoft.com/office/drawing/2017/model3d" xmlns:o="urn:schemas-microsoft-com:office:office" xmlns:oel="http://schemas.microsoft.com/office/2019/extlst" xmlns:r="http://schemas.openxmlformats.org/officeDocument/2006/relationships" xmlns:m="http://schemas.openxmlformats.org/officeDocument/2006/math" xmlns:v="urn:schemas-microsoft-com:vml" xmlns:wp14="http://schemas.microsoft.com/office/word/2010/wordprocessingDrawing" xmlns:wp="http://schemas.openxmlformats.org/drawingml/2006/wordprocessingDrawing" xmlns:w10="urn:schemas-microsoft-com:office:word" xmlns:w="http://schemas.openxmlformats.org/wordprocessingml/2006/main" xmlns:w14="http://schemas.microsoft.com/office/word/2010/wordml" xmlns:w15="http://schemas.microsoft.com/office/word/2012/wordml" xmlns:w16cex="http://schemas.microsoft.com/office/word/2018/wordml/cex" xmlns:w16cid="http://schemas.microsoft.com/office/word/2016/wordml/cid" xmlns:w16="http://schemas.microsoft.com/office/word/2018/wordml" xmlns:w16du="http://schemas.microsoft.com/office/word/2023/wordml/word16du" xmlns:w16sdtdh="http://schemas.microsoft.com/office/word/2020/wordml/sdtdatahash" xmlns:w16sdtfl="http://schemas.microsoft.com/office/word/2024/wordml/sdtformatlock" xmlns:w16se="http://schemas.microsoft.com/office/word/2015/wordml/symex" xmlns:wpg="http://schemas.microsoft.com/office/word/2010/wordprocessingGroup" xmlns:wpi="http://schemas.microsoft.com/office/word/2010/wordprocessingInk" xmlns:wne="http://schemas.microsoft.com/office/word/2006/wordml" xmlns:wps="http://schemas.microsoft.com/office/word/2010/wordprocessingShape" mc:Ignorable="w14 w15 w16se w16cid w16 w16cex w16sdtdh w16sdtfl w16du wp14">
+<w:endnotes xmlns:wpc="http://schemas.microsoft.com/office/word/2010/wordprocessingCanvas" xmlns:cx="http://schemas.microsoft.com/office/drawing/2014/chartex" xmlns:mc="http://schemas.openxmlformats.org/markup-compatibility/2006" xmlns:o="urn:schemas-microsoft-com:office:office" xmlns:r="http://schemas.openxmlformats.org/officeDocument/2006/relationships" xmlns:m="http://schemas.openxmlformats.org/officeDocument/2006/math" xmlns:v="urn:schemas-microsoft-com:vml" xmlns:wp14="http://schemas.microsoft.com/office/word/2010/wordprocessingDrawing" xmlns:wp="http://schemas.openxmlformats.org/drawingml/2006/wordprocessingDrawing" xmlns:w10="urn:schemas-microsoft-com:office:word" xmlns:w="http://schemas.openxmlformats.org/wordprocessingml/2006/main" xmlns:w14="http://schemas.microsoft.com/office/word/2010/wordml" xmlns:w15="http://schemas.microsoft.com/office/word/2012/wordml" xmlns:w16se="http://schemas.microsoft.com/office/word/2015/wordml/symex" xmlns:wpg="http://schemas.microsoft.com/office/word/2010/wordprocessingGroup" xmlns:wpi="http://schemas.microsoft.com/office/word/2010/wordprocessingInk" xmlns:wne="http://schemas.microsoft.com/office/word/2006/wordml" xmlns:wps="http://schemas.microsoft.com/office/word/2010/wordprocessingShape" mc:Ignorable="w14 w15 w16se wp14">
   <w:endnote w:type="separator" w:id="-1">
     <w:p>
       <w:pPr>
@@ -39924,7 +38988,7 @@
 </file>
 
 <file path=word/footer1.xml><?xml version="1.0" encoding="utf-8"?>
-<w:ftr xmlns:wpc="http://schemas.microsoft.com/office/word/2010/wordprocessingCanvas" xmlns:cx="http://schemas.microsoft.com/office/drawing/2014/chartex" xmlns:cx1="http://schemas.microsoft.com/office/drawing/2015/9/8/chartex" xmlns:cx2="http://schemas.microsoft.com/office/drawing/2015/10/21/chartex" xmlns:cx3="http://schemas.microsoft.com/office/drawing/2016/5/9/chartex" xmlns:cx4="http://schemas.microsoft.com/office/drawing/2016/5/10/chartex" xmlns:cx5="http://schemas.microsoft.com/office/drawing/2016/5/11/chartex" xmlns:cx6="http://schemas.microsoft.com/office/drawing/2016/5/12/chartex" xmlns:cx7="http://schemas.microsoft.com/office/drawing/2016/5/13/chartex" xmlns:cx8="http://schemas.microsoft.com/office/drawing/2016/5/14/chartex" xmlns:mc="http://schemas.openxmlformats.org/markup-compatibility/2006" xmlns:aink="http://schemas.microsoft.com/office/drawing/2016/ink" xmlns:am3d="http://schemas.microsoft.com/office/drawing/2017/model3d" xmlns:o="urn:schemas-microsoft-com:office:office" xmlns:oel="http://schemas.microsoft.com/office/2019/extlst" xmlns:r="http://schemas.openxmlformats.org/officeDocument/2006/relationships" xmlns:m="http://schemas.openxmlformats.org/officeDocument/2006/math" xmlns:v="urn:schemas-microsoft-com:vml" xmlns:wp14="http://schemas.microsoft.com/office/word/2010/wordprocessingDrawing" xmlns:wp="http://schemas.openxmlformats.org/drawingml/2006/wordprocessingDrawing" xmlns:w10="urn:schemas-microsoft-com:office:word" xmlns:w="http://schemas.openxmlformats.org/wordprocessingml/2006/main" xmlns:w14="http://schemas.microsoft.com/office/word/2010/wordml" xmlns:w15="http://schemas.microsoft.com/office/word/2012/wordml" xmlns:w16cex="http://schemas.microsoft.com/office/word/2018/wordml/cex" xmlns:w16cid="http://schemas.microsoft.com/office/word/2016/wordml/cid" xmlns:w16="http://schemas.microsoft.com/office/word/2018/wordml" xmlns:w16du="http://schemas.microsoft.com/office/word/2023/wordml/word16du" xmlns:w16sdtdh="http://schemas.microsoft.com/office/word/2020/wordml/sdtdatahash" xmlns:w16sdtfl="http://schemas.microsoft.com/office/word/2024/wordml/sdtformatlock" xmlns:w16se="http://schemas.microsoft.com/office/word/2015/wordml/symex" xmlns:wpg="http://schemas.microsoft.com/office/word/2010/wordprocessingGroup" xmlns:wpi="http://schemas.microsoft.com/office/word/2010/wordprocessingInk" xmlns:wne="http://schemas.microsoft.com/office/word/2006/wordml" xmlns:wps="http://schemas.microsoft.com/office/word/2010/wordprocessingShape" mc:Ignorable="w14 w15 w16se w16cid w16 w16cex w16sdtdh w16sdtfl w16du wp14">
+<w:ftr xmlns:wpc="http://schemas.microsoft.com/office/word/2010/wordprocessingCanvas" xmlns:cx="http://schemas.microsoft.com/office/drawing/2014/chartex" xmlns:mc="http://schemas.openxmlformats.org/markup-compatibility/2006" xmlns:o="urn:schemas-microsoft-com:office:office" xmlns:r="http://schemas.openxmlformats.org/officeDocument/2006/relationships" xmlns:m="http://schemas.openxmlformats.org/officeDocument/2006/math" xmlns:v="urn:schemas-microsoft-com:vml" xmlns:wp14="http://schemas.microsoft.com/office/word/2010/wordprocessingDrawing" xmlns:wp="http://schemas.openxmlformats.org/drawingml/2006/wordprocessingDrawing" xmlns:w10="urn:schemas-microsoft-com:office:word" xmlns:w="http://schemas.openxmlformats.org/wordprocessingml/2006/main" xmlns:w14="http://schemas.microsoft.com/office/word/2010/wordml" xmlns:w15="http://schemas.microsoft.com/office/word/2012/wordml" xmlns:w16se="http://schemas.microsoft.com/office/word/2015/wordml/symex" xmlns:wpg="http://schemas.microsoft.com/office/word/2010/wordprocessingGroup" xmlns:wpi="http://schemas.microsoft.com/office/word/2010/wordprocessingInk" xmlns:wne="http://schemas.microsoft.com/office/word/2006/wordml" xmlns:wps="http://schemas.microsoft.com/office/word/2010/wordprocessingShape" mc:Ignorable="w14 w15 w16se wp14">
   <w:sdt>
     <w:sdtPr>
       <w:id w:val="-694771059"/>
@@ -39953,7 +39017,7 @@
             <w:noProof/>
             <w:lang w:val="ko-KR"/>
           </w:rPr>
-          <w:t>4</w:t>
+          <w:t>11</w:t>
         </w:r>
         <w:r>
           <w:fldChar w:fldCharType="end"/>
@@ -39976,7 +39040,7 @@
 </file>
 
 <file path=word/footer2.xml><?xml version="1.0" encoding="utf-8"?>
-<w:ftr xmlns:wpc="http://schemas.microsoft.com/office/word/2010/wordprocessingCanvas" xmlns:cx="http://schemas.microsoft.com/office/drawing/2014/chartex" xmlns:cx1="http://schemas.microsoft.com/office/drawing/2015/9/8/chartex" xmlns:cx2="http://schemas.microsoft.com/office/drawing/2015/10/21/chartex" xmlns:cx3="http://schemas.microsoft.com/office/drawing/2016/5/9/chartex" xmlns:cx4="http://schemas.microsoft.com/office/drawing/2016/5/10/chartex" xmlns:cx5="http://schemas.microsoft.com/office/drawing/2016/5/11/chartex" xmlns:cx6="http://schemas.microsoft.com/office/drawing/2016/5/12/chartex" xmlns:cx7="http://schemas.microsoft.com/office/drawing/2016/5/13/chartex" xmlns:cx8="http://schemas.microsoft.com/office/drawing/2016/5/14/chartex" xmlns:mc="http://schemas.openxmlformats.org/markup-compatibility/2006" xmlns:aink="http://schemas.microsoft.com/office/drawing/2016/ink" xmlns:am3d="http://schemas.microsoft.com/office/drawing/2017/model3d" xmlns:o="urn:schemas-microsoft-com:office:office" xmlns:oel="http://schemas.microsoft.com/office/2019/extlst" xmlns:r="http://schemas.openxmlformats.org/officeDocument/2006/relationships" xmlns:m="http://schemas.openxmlformats.org/officeDocument/2006/math" xmlns:v="urn:schemas-microsoft-com:vml" xmlns:wp14="http://schemas.microsoft.com/office/word/2010/wordprocessingDrawing" xmlns:wp="http://schemas.openxmlformats.org/drawingml/2006/wordprocessingDrawing" xmlns:w10="urn:schemas-microsoft-com:office:word" xmlns:w="http://schemas.openxmlformats.org/wordprocessingml/2006/main" xmlns:w14="http://schemas.microsoft.com/office/word/2010/wordml" xmlns:w15="http://schemas.microsoft.com/office/word/2012/wordml" xmlns:w16cex="http://schemas.microsoft.com/office/word/2018/wordml/cex" xmlns:w16cid="http://schemas.microsoft.com/office/word/2016/wordml/cid" xmlns:w16="http://schemas.microsoft.com/office/word/2018/wordml" xmlns:w16du="http://schemas.microsoft.com/office/word/2023/wordml/word16du" xmlns:w16sdtdh="http://schemas.microsoft.com/office/word/2020/wordml/sdtdatahash" xmlns:w16sdtfl="http://schemas.microsoft.com/office/word/2024/wordml/sdtformatlock" xmlns:w16se="http://schemas.microsoft.com/office/word/2015/wordml/symex" xmlns:wpg="http://schemas.microsoft.com/office/word/2010/wordprocessingGroup" xmlns:wpi="http://schemas.microsoft.com/office/word/2010/wordprocessingInk" xmlns:wne="http://schemas.microsoft.com/office/word/2006/wordml" xmlns:wps="http://schemas.microsoft.com/office/word/2010/wordprocessingShape" mc:Ignorable="w14 w15 w16se w16cid w16 w16cex w16sdtdh w16sdtfl w16du wp14">
+<w:ftr xmlns:wpc="http://schemas.microsoft.com/office/word/2010/wordprocessingCanvas" xmlns:cx="http://schemas.microsoft.com/office/drawing/2014/chartex" xmlns:mc="http://schemas.openxmlformats.org/markup-compatibility/2006" xmlns:o="urn:schemas-microsoft-com:office:office" xmlns:r="http://schemas.openxmlformats.org/officeDocument/2006/relationships" xmlns:m="http://schemas.openxmlformats.org/officeDocument/2006/math" xmlns:v="urn:schemas-microsoft-com:vml" xmlns:wp14="http://schemas.microsoft.com/office/word/2010/wordprocessingDrawing" xmlns:wp="http://schemas.openxmlformats.org/drawingml/2006/wordprocessingDrawing" xmlns:w10="urn:schemas-microsoft-com:office:word" xmlns:w="http://schemas.openxmlformats.org/wordprocessingml/2006/main" xmlns:w14="http://schemas.microsoft.com/office/word/2010/wordml" xmlns:w15="http://schemas.microsoft.com/office/word/2012/wordml" xmlns:w16se="http://schemas.microsoft.com/office/word/2015/wordml/symex" xmlns:wpg="http://schemas.microsoft.com/office/word/2010/wordprocessingGroup" xmlns:wpi="http://schemas.microsoft.com/office/word/2010/wordprocessingInk" xmlns:wne="http://schemas.microsoft.com/office/word/2006/wordml" xmlns:wps="http://schemas.microsoft.com/office/word/2010/wordprocessingShape" mc:Ignorable="w14 w15 w16se wp14">
   <w:sdt>
     <w:sdtPr>
       <w:id w:val="2080251144"/>
@@ -40006,7 +39070,7 @@
 </file>
 
 <file path=word/footnotes.xml><?xml version="1.0" encoding="utf-8"?>
-<w:footnotes xmlns:wpc="http://schemas.microsoft.com/office/word/2010/wordprocessingCanvas" xmlns:cx="http://schemas.microsoft.com/office/drawing/2014/chartex" xmlns:cx1="http://schemas.microsoft.com/office/drawing/2015/9/8/chartex" xmlns:cx2="http://schemas.microsoft.com/office/drawing/2015/10/21/chartex" xmlns:cx3="http://schemas.microsoft.com/office/drawing/2016/5/9/chartex" xmlns:cx4="http://schemas.microsoft.com/office/drawing/2016/5/10/chartex" xmlns:cx5="http://schemas.microsoft.com/office/drawing/2016/5/11/chartex" xmlns:cx6="http://schemas.microsoft.com/office/drawing/2016/5/12/chartex" xmlns:cx7="http://schemas.microsoft.com/office/drawing/2016/5/13/chartex" xmlns:cx8="http://schemas.microsoft.com/office/drawing/2016/5/14/chartex" xmlns:mc="http://schemas.openxmlformats.org/markup-compatibility/2006" xmlns:aink="http://schemas.microsoft.com/office/drawing/2016/ink" xmlns:am3d="http://schemas.microsoft.com/office/drawing/2017/model3d" xmlns:o="urn:schemas-microsoft-com:office:office" xmlns:oel="http://schemas.microsoft.com/office/2019/extlst" xmlns:r="http://schemas.openxmlformats.org/officeDocument/2006/relationships" xmlns:m="http://schemas.openxmlformats.org/officeDocument/2006/math" xmlns:v="urn:schemas-microsoft-com:vml" xmlns:wp14="http://schemas.microsoft.com/office/word/2010/wordprocessingDrawing" xmlns:wp="http://schemas.openxmlformats.org/drawingml/2006/wordprocessingDrawing" xmlns:w10="urn:schemas-microsoft-com:office:word" xmlns:w="http://schemas.openxmlformats.org/wordprocessingml/2006/main" xmlns:w14="http://schemas.microsoft.com/office/word/2010/wordml" xmlns:w15="http://schemas.microsoft.com/office/word/2012/wordml" xmlns:w16cex="http://schemas.microsoft.com/office/word/2018/wordml/cex" xmlns:w16cid="http://schemas.microsoft.com/office/word/2016/wordml/cid" xmlns:w16="http://schemas.microsoft.com/office/word/2018/wordml" xmlns:w16du="http://schemas.microsoft.com/office/word/2023/wordml/word16du" xmlns:w16sdtdh="http://schemas.microsoft.com/office/word/2020/wordml/sdtdatahash" xmlns:w16sdtfl="http://schemas.microsoft.com/office/word/2024/wordml/sdtformatlock" xmlns:w16se="http://schemas.microsoft.com/office/word/2015/wordml/symex" xmlns:wpg="http://schemas.microsoft.com/office/word/2010/wordprocessingGroup" xmlns:wpi="http://schemas.microsoft.com/office/word/2010/wordprocessingInk" xmlns:wne="http://schemas.microsoft.com/office/word/2006/wordml" xmlns:wps="http://schemas.microsoft.com/office/word/2010/wordprocessingShape" mc:Ignorable="w14 w15 w16se w16cid w16 w16cex w16sdtdh w16sdtfl w16du wp14">
+<w:footnotes xmlns:wpc="http://schemas.microsoft.com/office/word/2010/wordprocessingCanvas" xmlns:cx="http://schemas.microsoft.com/office/drawing/2014/chartex" xmlns:mc="http://schemas.openxmlformats.org/markup-compatibility/2006" xmlns:o="urn:schemas-microsoft-com:office:office" xmlns:r="http://schemas.openxmlformats.org/officeDocument/2006/relationships" xmlns:m="http://schemas.openxmlformats.org/officeDocument/2006/math" xmlns:v="urn:schemas-microsoft-com:vml" xmlns:wp14="http://schemas.microsoft.com/office/word/2010/wordprocessingDrawing" xmlns:wp="http://schemas.openxmlformats.org/drawingml/2006/wordprocessingDrawing" xmlns:w10="urn:schemas-microsoft-com:office:word" xmlns:w="http://schemas.openxmlformats.org/wordprocessingml/2006/main" xmlns:w14="http://schemas.microsoft.com/office/word/2010/wordml" xmlns:w15="http://schemas.microsoft.com/office/word/2012/wordml" xmlns:w16se="http://schemas.microsoft.com/office/word/2015/wordml/symex" xmlns:wpg="http://schemas.microsoft.com/office/word/2010/wordprocessingGroup" xmlns:wpi="http://schemas.microsoft.com/office/word/2010/wordprocessingInk" xmlns:wne="http://schemas.microsoft.com/office/word/2006/wordml" xmlns:wps="http://schemas.microsoft.com/office/word/2010/wordprocessingShape" mc:Ignorable="w14 w15 w16se wp14">
   <w:footnote w:type="separator" w:id="-1">
     <w:p>
       <w:pPr>
@@ -40031,7 +39095,7 @@
 </file>
 
 <file path=word/numbering.xml><?xml version="1.0" encoding="utf-8"?>
-<w:numbering xmlns:wpc="http://schemas.microsoft.com/office/word/2010/wordprocessingCanvas" xmlns:cx="http://schemas.microsoft.com/office/drawing/2014/chartex" xmlns:cx1="http://schemas.microsoft.com/office/drawing/2015/9/8/chartex" xmlns:cx2="http://schemas.microsoft.com/office/drawing/2015/10/21/chartex" xmlns:cx3="http://schemas.microsoft.com/office/drawing/2016/5/9/chartex" xmlns:cx4="http://schemas.microsoft.com/office/drawing/2016/5/10/chartex" xmlns:cx5="http://schemas.microsoft.com/office/drawing/2016/5/11/chartex" xmlns:cx6="http://schemas.microsoft.com/office/drawing/2016/5/12/chartex" xmlns:cx7="http://schemas.microsoft.com/office/drawing/2016/5/13/chartex" xmlns:cx8="http://schemas.microsoft.com/office/drawing/2016/5/14/chartex" xmlns:mc="http://schemas.openxmlformats.org/markup-compatibility/2006" xmlns:aink="http://schemas.microsoft.com/office/drawing/2016/ink" xmlns:am3d="http://schemas.microsoft.com/office/drawing/2017/model3d" xmlns:o="urn:schemas-microsoft-com:office:office" xmlns:oel="http://schemas.microsoft.com/office/2019/extlst" xmlns:r="http://schemas.openxmlformats.org/officeDocument/2006/relationships" xmlns:m="http://schemas.openxmlformats.org/officeDocument/2006/math" xmlns:v="urn:schemas-microsoft-com:vml" xmlns:wp14="http://schemas.microsoft.com/office/word/2010/wordprocessingDrawing" xmlns:wp="http://schemas.openxmlformats.org/drawingml/2006/wordprocessingDrawing" xmlns:w10="urn:schemas-microsoft-com:office:word" xmlns:w="http://schemas.openxmlformats.org/wordprocessingml/2006/main" xmlns:w14="http://schemas.microsoft.com/office/word/2010/wordml" xmlns:w15="http://schemas.microsoft.com/office/word/2012/wordml" xmlns:w16cex="http://schemas.microsoft.com/office/word/2018/wordml/cex" xmlns:w16cid="http://schemas.microsoft.com/office/word/2016/wordml/cid" xmlns:w16="http://schemas.microsoft.com/office/word/2018/wordml" xmlns:w16du="http://schemas.microsoft.com/office/word/2023/wordml/word16du" xmlns:w16sdtdh="http://schemas.microsoft.com/office/word/2020/wordml/sdtdatahash" xmlns:w16sdtfl="http://schemas.microsoft.com/office/word/2024/wordml/sdtformatlock" xmlns:w16se="http://schemas.microsoft.com/office/word/2015/wordml/symex" xmlns:wpg="http://schemas.microsoft.com/office/word/2010/wordprocessingGroup" xmlns:wpi="http://schemas.microsoft.com/office/word/2010/wordprocessingInk" xmlns:wne="http://schemas.microsoft.com/office/word/2006/wordml" xmlns:wps="http://schemas.microsoft.com/office/word/2010/wordprocessingShape" mc:Ignorable="w14 w15 w16se w16cid w16 w16cex w16sdtdh w16sdtfl w16du wp14">
+<w:numbering xmlns:wpc="http://schemas.microsoft.com/office/word/2010/wordprocessingCanvas" xmlns:cx="http://schemas.microsoft.com/office/drawing/2014/chartex" xmlns:mc="http://schemas.openxmlformats.org/markup-compatibility/2006" xmlns:o="urn:schemas-microsoft-com:office:office" xmlns:r="http://schemas.openxmlformats.org/officeDocument/2006/relationships" xmlns:m="http://schemas.openxmlformats.org/officeDocument/2006/math" xmlns:v="urn:schemas-microsoft-com:vml" xmlns:wp14="http://schemas.microsoft.com/office/word/2010/wordprocessingDrawing" xmlns:wp="http://schemas.openxmlformats.org/drawingml/2006/wordprocessingDrawing" xmlns:w10="urn:schemas-microsoft-com:office:word" xmlns:w="http://schemas.openxmlformats.org/wordprocessingml/2006/main" xmlns:w14="http://schemas.microsoft.com/office/word/2010/wordml" xmlns:w15="http://schemas.microsoft.com/office/word/2012/wordml" xmlns:w16se="http://schemas.microsoft.com/office/word/2015/wordml/symex" xmlns:wpg="http://schemas.microsoft.com/office/word/2010/wordprocessingGroup" xmlns:wpi="http://schemas.microsoft.com/office/word/2010/wordprocessingInk" xmlns:wne="http://schemas.microsoft.com/office/word/2006/wordml" xmlns:wps="http://schemas.microsoft.com/office/word/2010/wordprocessingShape" mc:Ignorable="w14 w15 w16se wp14">
   <w:abstractNum w:abstractNumId="0" w15:restartNumberingAfterBreak="0">
     <w:nsid w:val="1F855F64"/>
     <w:multiLevelType w:val="hybridMultilevel"/>
@@ -40467,23 +39531,23 @@
       </w:rPr>
     </w:lvl>
   </w:abstractNum>
-  <w:num w:numId="1" w16cid:durableId="1314455654">
+  <w:num w:numId="1">
     <w:abstractNumId w:val="2"/>
   </w:num>
-  <w:num w:numId="2" w16cid:durableId="118955805">
+  <w:num w:numId="2">
     <w:abstractNumId w:val="3"/>
   </w:num>
-  <w:num w:numId="3" w16cid:durableId="1770924399">
+  <w:num w:numId="3">
     <w:abstractNumId w:val="0"/>
   </w:num>
-  <w:num w:numId="4" w16cid:durableId="810752905">
+  <w:num w:numId="4">
     <w:abstractNumId w:val="1"/>
   </w:num>
 </w:numbering>
 </file>
 
 <file path=word/styles.xml><?xml version="1.0" encoding="utf-8"?>
-<w:styles xmlns:mc="http://schemas.openxmlformats.org/markup-compatibility/2006" xmlns:r="http://schemas.openxmlformats.org/officeDocument/2006/relationships" xmlns:w="http://schemas.openxmlformats.org/wordprocessingml/2006/main" xmlns:w14="http://schemas.microsoft.com/office/word/2010/wordml" xmlns:w15="http://schemas.microsoft.com/office/word/2012/wordml" xmlns:w16cex="http://schemas.microsoft.com/office/word/2018/wordml/cex" xmlns:w16cid="http://schemas.microsoft.com/office/word/2016/wordml/cid" xmlns:w16="http://schemas.microsoft.com/office/word/2018/wordml" xmlns:w16du="http://schemas.microsoft.com/office/word/2023/wordml/word16du" xmlns:w16sdtdh="http://schemas.microsoft.com/office/word/2020/wordml/sdtdatahash" xmlns:w16sdtfl="http://schemas.microsoft.com/office/word/2024/wordml/sdtformatlock" xmlns:w16se="http://schemas.microsoft.com/office/word/2015/wordml/symex" mc:Ignorable="w14 w15 w16se w16cid w16 w16cex w16sdtdh w16sdtfl w16du">
+<w:styles xmlns:mc="http://schemas.openxmlformats.org/markup-compatibility/2006" xmlns:r="http://schemas.openxmlformats.org/officeDocument/2006/relationships" xmlns:w="http://schemas.openxmlformats.org/wordprocessingml/2006/main" xmlns:w14="http://schemas.microsoft.com/office/word/2010/wordml" xmlns:w15="http://schemas.microsoft.com/office/word/2012/wordml" xmlns:w16se="http://schemas.microsoft.com/office/word/2015/wordml/symex" mc:Ignorable="w14 w15 w16se">
   <w:docDefaults>
     <w:rPrDefault>
       <w:rPr>
@@ -40500,7 +39564,7 @@
       </w:pPr>
     </w:pPrDefault>
   </w:docDefaults>
-  <w:latentStyles w:defLockedState="0" w:defUIPriority="99" w:defSemiHidden="0" w:defUnhideWhenUsed="0" w:defQFormat="0" w:count="376">
+  <w:latentStyles w:defLockedState="0" w:defUIPriority="99" w:defSemiHidden="0" w:defUnhideWhenUsed="0" w:defQFormat="0" w:count="371">
     <w:lsdException w:name="Normal" w:uiPriority="0" w:qFormat="1"/>
     <w:lsdException w:name="heading 1" w:uiPriority="9" w:qFormat="1"/>
     <w:lsdException w:name="heading 2" w:semiHidden="1" w:uiPriority="9" w:unhideWhenUsed="1" w:qFormat="1"/>
@@ -40872,11 +39936,6 @@
     <w:lsdException w:name="List Table 5 Dark Accent 6" w:uiPriority="50"/>
     <w:lsdException w:name="List Table 6 Colorful Accent 6" w:uiPriority="51"/>
     <w:lsdException w:name="List Table 7 Colorful Accent 6" w:uiPriority="52"/>
-    <w:lsdException w:name="Mention" w:semiHidden="1" w:unhideWhenUsed="1"/>
-    <w:lsdException w:name="Smart Hyperlink" w:semiHidden="1" w:unhideWhenUsed="1"/>
-    <w:lsdException w:name="Hashtag" w:semiHidden="1" w:unhideWhenUsed="1"/>
-    <w:lsdException w:name="Unresolved Mention" w:semiHidden="1" w:unhideWhenUsed="1"/>
-    <w:lsdException w:name="Smart Link" w:semiHidden="1" w:unhideWhenUsed="1"/>
   </w:latentStyles>
   <w:style w:type="paragraph" w:default="1" w:styleId="a0">
     <w:name w:val="Normal"/>
@@ -41870,7 +40929,649 @@
       <w:szCs w:val="20"/>
     </w:rPr>
   </w:style>
+  <w:style w:type="paragraph" w:styleId="TOC">
+    <w:name w:val="TOC Heading"/>
+    <w:basedOn w:val="10"/>
+    <w:next w:val="a0"/>
+    <w:uiPriority w:val="39"/>
+    <w:unhideWhenUsed/>
+    <w:qFormat/>
+    <w:rsid w:val="003A78CC"/>
+    <w:pPr>
+      <w:keepLines/>
+      <w:spacing w:before="240" w:after="0"/>
+      <w:jc w:val="left"/>
+      <w:outlineLvl w:val="9"/>
+    </w:pPr>
+    <w:rPr>
+      <w:color w:val="2E74B5" w:themeColor="accent1" w:themeShade="BF"/>
+      <w:kern w:val="0"/>
+      <w:sz w:val="32"/>
+      <w:szCs w:val="32"/>
+    </w:rPr>
+  </w:style>
+  <w:style w:type="paragraph" w:styleId="20">
+    <w:name w:val="toc 2"/>
+    <w:basedOn w:val="a0"/>
+    <w:next w:val="a0"/>
+    <w:autoRedefine/>
+    <w:uiPriority w:val="39"/>
+    <w:unhideWhenUsed/>
+    <w:rsid w:val="003A78CC"/>
+    <w:pPr>
+      <w:spacing w:after="100"/>
+      <w:ind w:left="220"/>
+      <w:jc w:val="left"/>
+    </w:pPr>
+    <w:rPr>
+      <w:rFonts w:eastAsiaTheme="minorEastAsia" w:cs="Times New Roman"/>
+      <w:kern w:val="0"/>
+      <w:szCs w:val="22"/>
+    </w:rPr>
+  </w:style>
+  <w:style w:type="paragraph" w:styleId="30">
+    <w:name w:val="toc 3"/>
+    <w:basedOn w:val="a0"/>
+    <w:next w:val="a0"/>
+    <w:autoRedefine/>
+    <w:uiPriority w:val="39"/>
+    <w:unhideWhenUsed/>
+    <w:rsid w:val="003A78CC"/>
+    <w:pPr>
+      <w:spacing w:after="100"/>
+      <w:ind w:left="440"/>
+      <w:jc w:val="left"/>
+    </w:pPr>
+    <w:rPr>
+      <w:rFonts w:eastAsiaTheme="minorEastAsia" w:cs="Times New Roman"/>
+      <w:kern w:val="0"/>
+      <w:szCs w:val="22"/>
+    </w:rPr>
+  </w:style>
 </w:styles>
+</file>
+
+<file path=word/glossary/document.xml><?xml version="1.0" encoding="utf-8"?>
+<w:glossaryDocument xmlns:wpc="http://schemas.microsoft.com/office/word/2010/wordprocessingCanvas" xmlns:cx="http://schemas.microsoft.com/office/drawing/2014/chartex" xmlns:mc="http://schemas.openxmlformats.org/markup-compatibility/2006" xmlns:o="urn:schemas-microsoft-com:office:office" xmlns:r="http://schemas.openxmlformats.org/officeDocument/2006/relationships" xmlns:m="http://schemas.openxmlformats.org/officeDocument/2006/math" xmlns:v="urn:schemas-microsoft-com:vml" xmlns:wp14="http://schemas.microsoft.com/office/word/2010/wordprocessingDrawing" xmlns:wp="http://schemas.openxmlformats.org/drawingml/2006/wordprocessingDrawing" xmlns:w10="urn:schemas-microsoft-com:office:word" xmlns:w="http://schemas.openxmlformats.org/wordprocessingml/2006/main" xmlns:w14="http://schemas.microsoft.com/office/word/2010/wordml" xmlns:w15="http://schemas.microsoft.com/office/word/2012/wordml" xmlns:w16se="http://schemas.microsoft.com/office/word/2015/wordml/symex" xmlns:wpg="http://schemas.microsoft.com/office/word/2010/wordprocessingGroup" xmlns:wpi="http://schemas.microsoft.com/office/word/2010/wordprocessingInk" xmlns:wne="http://schemas.microsoft.com/office/word/2006/wordml" xmlns:wps="http://schemas.microsoft.com/office/word/2010/wordprocessingShape" mc:Ignorable="w14 w15 w16se wp14"/>
+</file>
+
+<file path=word/glossary/fontTable.xml><?xml version="1.0" encoding="utf-8"?>
+<w:fonts xmlns:mc="http://schemas.openxmlformats.org/markup-compatibility/2006" xmlns:r="http://schemas.openxmlformats.org/officeDocument/2006/relationships" xmlns:w="http://schemas.openxmlformats.org/wordprocessingml/2006/main" xmlns:w14="http://schemas.microsoft.com/office/word/2010/wordml" xmlns:w15="http://schemas.microsoft.com/office/word/2012/wordml" xmlns:w16se="http://schemas.microsoft.com/office/word/2015/wordml/symex" mc:Ignorable="w14 w15 w16se">
+  <w:font w:name="Times New Roman">
+    <w:panose1 w:val="02020603050405020304"/>
+    <w:charset w:val="00"/>
+    <w:family w:val="roman"/>
+    <w:pitch w:val="variable"/>
+    <w:sig w:usb0="E0002AFF" w:usb1="C0007843" w:usb2="00000009" w:usb3="00000000" w:csb0="000001FF" w:csb1="00000000"/>
+  </w:font>
+  <w:font w:name="휴먼명조">
+    <w:altName w:val="맑은 고딕"/>
+    <w:charset w:val="81"/>
+    <w:family w:val="auto"/>
+    <w:pitch w:val="variable"/>
+    <w:sig w:usb0="800002A7" w:usb1="19D77CFB" w:usb2="00000010" w:usb3="00000000" w:csb0="00080000" w:csb1="00000000"/>
+  </w:font>
+  <w:font w:name="맑은 고딕">
+    <w:panose1 w:val="020B0503020000020004"/>
+    <w:charset w:val="81"/>
+    <w:family w:val="modern"/>
+    <w:pitch w:val="variable"/>
+    <w:sig w:usb0="9000002F" w:usb1="29D77CFB" w:usb2="00000012" w:usb3="00000000" w:csb0="00080001" w:csb1="00000000"/>
+  </w:font>
+  <w:font w:name="Wingdings">
+    <w:panose1 w:val="05000000000000000000"/>
+    <w:charset w:val="02"/>
+    <w:family w:val="auto"/>
+    <w:pitch w:val="variable"/>
+    <w:sig w:usb0="00000000" w:usb1="10000000" w:usb2="00000000" w:usb3="00000000" w:csb0="80000000" w:csb1="00000000"/>
+  </w:font>
+  <w:font w:name="한컴바탕">
+    <w:altName w:val="바탕"/>
+    <w:charset w:val="81"/>
+    <w:family w:val="roman"/>
+    <w:pitch w:val="variable"/>
+    <w:sig w:usb0="F7FFAFFF" w:usb1="FBDFFFFF" w:usb2="00FFFFFF" w:usb3="00000000" w:csb0="803F01FF" w:csb1="00000000"/>
+  </w:font>
+  <w:font w:name="HY중고딕">
+    <w:panose1 w:val="02030600000101010101"/>
+    <w:charset w:val="81"/>
+    <w:family w:val="roman"/>
+    <w:pitch w:val="variable"/>
+    <w:sig w:usb0="900002A7" w:usb1="29D77CF9" w:usb2="00000010" w:usb3="00000000" w:csb0="00080000" w:csb1="00000000"/>
+  </w:font>
+  <w:font w:name="HY헤드라인M">
+    <w:panose1 w:val="02030600000101010101"/>
+    <w:charset w:val="81"/>
+    <w:family w:val="roman"/>
+    <w:pitch w:val="variable"/>
+    <w:sig w:usb0="900002A7" w:usb1="09D77CF9" w:usb2="00000010" w:usb3="00000000" w:csb0="00080000" w:csb1="00000000"/>
+  </w:font>
+  <w:font w:name="굴림">
+    <w:altName w:val="Gulim"/>
+    <w:panose1 w:val="020B0600000101010101"/>
+    <w:charset w:val="81"/>
+    <w:family w:val="modern"/>
+    <w:pitch w:val="variable"/>
+    <w:sig w:usb0="B00002AF" w:usb1="69D77CFB" w:usb2="00000030" w:usb3="00000000" w:csb0="0008009F" w:csb1="00000000"/>
+  </w:font>
+</w:fonts>
+</file>
+
+<file path=word/glossary/settings.xml><?xml version="1.0" encoding="utf-8"?>
+<w:settings xmlns:mc="http://schemas.openxmlformats.org/markup-compatibility/2006" xmlns:o="urn:schemas-microsoft-com:office:office" xmlns:r="http://schemas.openxmlformats.org/officeDocument/2006/relationships" xmlns:m="http://schemas.openxmlformats.org/officeDocument/2006/math" xmlns:v="urn:schemas-microsoft-com:vml" xmlns:w10="urn:schemas-microsoft-com:office:word" xmlns:w="http://schemas.openxmlformats.org/wordprocessingml/2006/main" xmlns:w14="http://schemas.microsoft.com/office/word/2010/wordml" xmlns:w15="http://schemas.microsoft.com/office/word/2012/wordml" xmlns:w16se="http://schemas.microsoft.com/office/word/2015/wordml/symex" xmlns:sl="http://schemas.openxmlformats.org/schemaLibrary/2006/main" mc:Ignorable="w14 w15 w16se">
+  <w:view w:val="normal"/>
+  <w:bordersDoNotSurroundHeader/>
+  <w:bordersDoNotSurroundFooter/>
+  <w:defaultTabStop w:val="800"/>
+  <w:displayHorizontalDrawingGridEvery w:val="0"/>
+  <w:displayVerticalDrawingGridEvery w:val="2"/>
+  <w:noPunctuationKerning/>
+  <w:characterSpacingControl w:val="doNotCompress"/>
+  <w:compat>
+    <w:spaceForUL/>
+    <w:balanceSingleByteDoubleByteWidth/>
+    <w:doNotLeaveBackslashAlone/>
+    <w:ulTrailSpace/>
+    <w:doNotExpandShiftReturn/>
+    <w:adjustLineHeightInTable/>
+    <w:useFELayout/>
+    <w:compatSetting w:name="compatibilityMode" w:uri="http://schemas.microsoft.com/office/word" w:val="15"/>
+    <w:compatSetting w:name="overrideTableStyleFontSizeAndJustification" w:uri="http://schemas.microsoft.com/office/word" w:val="1"/>
+    <w:compatSetting w:name="enableOpenTypeFeatures" w:uri="http://schemas.microsoft.com/office/word" w:val="1"/>
+    <w:compatSetting w:name="doNotFlipMirrorIndents" w:uri="http://schemas.microsoft.com/office/word" w:val="1"/>
+    <w:compatSetting w:name="differentiateMultirowTableHeaders" w:uri="http://schemas.microsoft.com/office/word" w:val="1"/>
+  </w:compat>
+  <w:rsids>
+    <w:rsidRoot w:val="00747AAF"/>
+    <w:rsid w:val="00747AAF"/>
+  </w:rsids>
+  <m:mathPr>
+    <m:mathFont m:val="Cambria Math"/>
+    <m:brkBin m:val="before"/>
+    <m:brkBinSub m:val="--"/>
+    <m:smallFrac m:val="0"/>
+    <m:dispDef/>
+    <m:lMargin m:val="0"/>
+    <m:rMargin m:val="0"/>
+    <m:defJc m:val="centerGroup"/>
+    <m:wrapIndent m:val="1440"/>
+    <m:intLim m:val="subSup"/>
+    <m:naryLim m:val="undOvr"/>
+  </m:mathPr>
+  <w:themeFontLang w:val="en-US" w:eastAsia="ko-KR"/>
+  <w:clrSchemeMapping w:bg1="light1" w:t1="dark1" w:bg2="light2" w:t2="dark2" w:accent1="accent1" w:accent2="accent2" w:accent3="accent3" w:accent4="accent4" w:accent5="accent5" w:accent6="accent6" w:hyperlink="hyperlink" w:followedHyperlink="followedHyperlink"/>
+  <w:decimalSymbol w:val="."/>
+  <w:listSeparator w:val=","/>
+  <w15:chartTrackingRefBased/>
+</w:settings>
+</file>
+
+<file path=word/glossary/styles.xml><?xml version="1.0" encoding="utf-8"?>
+<w:styles xmlns:mc="http://schemas.openxmlformats.org/markup-compatibility/2006" xmlns:r="http://schemas.openxmlformats.org/officeDocument/2006/relationships" xmlns:w="http://schemas.openxmlformats.org/wordprocessingml/2006/main" xmlns:w14="http://schemas.microsoft.com/office/word/2010/wordml" xmlns:w15="http://schemas.microsoft.com/office/word/2012/wordml" xmlns:w16se="http://schemas.microsoft.com/office/word/2015/wordml/symex" mc:Ignorable="w14 w15 w16se">
+  <w:docDefaults>
+    <w:rPrDefault>
+      <w:rPr>
+        <w:rFonts w:asciiTheme="minorHAnsi" w:eastAsiaTheme="minorEastAsia" w:hAnsiTheme="minorHAnsi" w:cstheme="minorBidi"/>
+        <w:kern w:val="2"/>
+        <w:szCs w:val="22"/>
+        <w:lang w:val="en-US" w:eastAsia="ko-KR" w:bidi="ar-SA"/>
+      </w:rPr>
+    </w:rPrDefault>
+    <w:pPrDefault>
+      <w:pPr>
+        <w:spacing w:after="160" w:line="259" w:lineRule="auto"/>
+        <w:jc w:val="both"/>
+      </w:pPr>
+    </w:pPrDefault>
+  </w:docDefaults>
+  <w:latentStyles w:defLockedState="0" w:defUIPriority="99" w:defSemiHidden="0" w:defUnhideWhenUsed="0" w:defQFormat="0" w:count="371">
+    <w:lsdException w:name="Normal" w:uiPriority="0" w:qFormat="1"/>
+    <w:lsdException w:name="heading 1" w:uiPriority="9" w:qFormat="1"/>
+    <w:lsdException w:name="heading 2" w:semiHidden="1" w:uiPriority="9" w:unhideWhenUsed="1" w:qFormat="1"/>
+    <w:lsdException w:name="heading 3" w:semiHidden="1" w:uiPriority="9" w:unhideWhenUsed="1" w:qFormat="1"/>
+    <w:lsdException w:name="heading 4" w:semiHidden="1" w:uiPriority="9" w:unhideWhenUsed="1" w:qFormat="1"/>
+    <w:lsdException w:name="heading 5" w:semiHidden="1" w:uiPriority="9" w:unhideWhenUsed="1" w:qFormat="1"/>
+    <w:lsdException w:name="heading 6" w:semiHidden="1" w:uiPriority="9" w:unhideWhenUsed="1" w:qFormat="1"/>
+    <w:lsdException w:name="heading 7" w:semiHidden="1" w:uiPriority="9" w:unhideWhenUsed="1" w:qFormat="1"/>
+    <w:lsdException w:name="heading 8" w:semiHidden="1" w:uiPriority="9" w:unhideWhenUsed="1" w:qFormat="1"/>
+    <w:lsdException w:name="heading 9" w:semiHidden="1" w:uiPriority="9" w:unhideWhenUsed="1" w:qFormat="1"/>
+    <w:lsdException w:name="index 1" w:semiHidden="1" w:unhideWhenUsed="1"/>
+    <w:lsdException w:name="index 2" w:semiHidden="1" w:unhideWhenUsed="1"/>
+    <w:lsdException w:name="index 3" w:semiHidden="1" w:unhideWhenUsed="1"/>
+    <w:lsdException w:name="index 4" w:semiHidden="1" w:unhideWhenUsed="1"/>
+    <w:lsdException w:name="index 5" w:semiHidden="1" w:unhideWhenUsed="1"/>
+    <w:lsdException w:name="index 6" w:semiHidden="1" w:unhideWhenUsed="1"/>
+    <w:lsdException w:name="index 7" w:semiHidden="1" w:unhideWhenUsed="1"/>
+    <w:lsdException w:name="index 8" w:semiHidden="1" w:unhideWhenUsed="1"/>
+    <w:lsdException w:name="index 9" w:semiHidden="1" w:unhideWhenUsed="1"/>
+    <w:lsdException w:name="toc 1" w:semiHidden="1" w:uiPriority="39" w:unhideWhenUsed="1"/>
+    <w:lsdException w:name="toc 2" w:semiHidden="1" w:uiPriority="39" w:unhideWhenUsed="1"/>
+    <w:lsdException w:name="toc 3" w:semiHidden="1" w:uiPriority="39" w:unhideWhenUsed="1"/>
+    <w:lsdException w:name="toc 4" w:semiHidden="1" w:uiPriority="39" w:unhideWhenUsed="1"/>
+    <w:lsdException w:name="toc 5" w:semiHidden="1" w:uiPriority="39" w:unhideWhenUsed="1"/>
+    <w:lsdException w:name="toc 6" w:semiHidden="1" w:uiPriority="39" w:unhideWhenUsed="1"/>
+    <w:lsdException w:name="toc 7" w:semiHidden="1" w:uiPriority="39" w:unhideWhenUsed="1"/>
+    <w:lsdException w:name="toc 8" w:semiHidden="1" w:uiPriority="39" w:unhideWhenUsed="1"/>
+    <w:lsdException w:name="toc 9" w:semiHidden="1" w:uiPriority="39" w:unhideWhenUsed="1"/>
+    <w:lsdException w:name="Normal Indent" w:semiHidden="1" w:unhideWhenUsed="1"/>
+    <w:lsdException w:name="footnote text" w:semiHidden="1" w:unhideWhenUsed="1"/>
+    <w:lsdException w:name="annotation text" w:semiHidden="1" w:unhideWhenUsed="1"/>
+    <w:lsdException w:name="header" w:semiHidden="1" w:unhideWhenUsed="1"/>
+    <w:lsdException w:name="footer" w:semiHidden="1" w:unhideWhenUsed="1"/>
+    <w:lsdException w:name="index heading" w:semiHidden="1" w:unhideWhenUsed="1"/>
+    <w:lsdException w:name="caption" w:semiHidden="1" w:uiPriority="35" w:unhideWhenUsed="1" w:qFormat="1"/>
+    <w:lsdException w:name="table of figures" w:semiHidden="1" w:unhideWhenUsed="1"/>
+    <w:lsdException w:name="envelope address" w:semiHidden="1" w:unhideWhenUsed="1"/>
+    <w:lsdException w:name="envelope return" w:semiHidden="1" w:unhideWhenUsed="1"/>
+    <w:lsdException w:name="footnote reference" w:semiHidden="1" w:unhideWhenUsed="1"/>
+    <w:lsdException w:name="annotation reference" w:semiHidden="1" w:unhideWhenUsed="1"/>
+    <w:lsdException w:name="line number" w:semiHidden="1" w:unhideWhenUsed="1"/>
+    <w:lsdException w:name="page number" w:semiHidden="1" w:unhideWhenUsed="1"/>
+    <w:lsdException w:name="endnote reference" w:semiHidden="1" w:unhideWhenUsed="1"/>
+    <w:lsdException w:name="endnote text" w:semiHidden="1" w:unhideWhenUsed="1"/>
+    <w:lsdException w:name="table of authorities" w:semiHidden="1" w:unhideWhenUsed="1"/>
+    <w:lsdException w:name="macro" w:semiHidden="1" w:unhideWhenUsed="1"/>
+    <w:lsdException w:name="toa heading" w:semiHidden="1" w:unhideWhenUsed="1"/>
+    <w:lsdException w:name="List" w:semiHidden="1" w:unhideWhenUsed="1"/>
+    <w:lsdException w:name="List Bullet" w:semiHidden="1" w:unhideWhenUsed="1"/>
+    <w:lsdException w:name="List Number" w:semiHidden="1" w:unhideWhenUsed="1"/>
+    <w:lsdException w:name="List 2" w:semiHidden="1" w:unhideWhenUsed="1"/>
+    <w:lsdException w:name="List 3" w:semiHidden="1" w:unhideWhenUsed="1"/>
+    <w:lsdException w:name="List 4" w:semiHidden="1" w:unhideWhenUsed="1"/>
+    <w:lsdException w:name="List 5" w:semiHidden="1" w:unhideWhenUsed="1"/>
+    <w:lsdException w:name="List Bullet 2" w:semiHidden="1" w:unhideWhenUsed="1"/>
+    <w:lsdException w:name="List Bullet 3" w:semiHidden="1" w:unhideWhenUsed="1"/>
+    <w:lsdException w:name="List Bullet 4" w:semiHidden="1" w:unhideWhenUsed="1"/>
+    <w:lsdException w:name="List Bullet 5" w:semiHidden="1" w:unhideWhenUsed="1"/>
+    <w:lsdException w:name="List Number 2" w:semiHidden="1" w:unhideWhenUsed="1"/>
+    <w:lsdException w:name="List Number 3" w:semiHidden="1" w:unhideWhenUsed="1"/>
+    <w:lsdException w:name="List Number 4" w:semiHidden="1" w:unhideWhenUsed="1"/>
+    <w:lsdException w:name="List Number 5" w:semiHidden="1" w:unhideWhenUsed="1"/>
+    <w:lsdException w:name="Title" w:uiPriority="10" w:qFormat="1"/>
+    <w:lsdException w:name="Closing" w:semiHidden="1" w:unhideWhenUsed="1"/>
+    <w:lsdException w:name="Signature" w:semiHidden="1" w:unhideWhenUsed="1"/>
+    <w:lsdException w:name="Default Paragraph Font" w:semiHidden="1" w:uiPriority="1" w:unhideWhenUsed="1"/>
+    <w:lsdException w:name="Body Text" w:semiHidden="1" w:unhideWhenUsed="1"/>
+    <w:lsdException w:name="Body Text Indent" w:semiHidden="1" w:unhideWhenUsed="1"/>
+    <w:lsdException w:name="List Continue" w:semiHidden="1" w:unhideWhenUsed="1"/>
+    <w:lsdException w:name="List Continue 2" w:semiHidden="1" w:unhideWhenUsed="1"/>
+    <w:lsdException w:name="List Continue 3" w:semiHidden="1" w:unhideWhenUsed="1"/>
+    <w:lsdException w:name="List Continue 4" w:semiHidden="1" w:unhideWhenUsed="1"/>
+    <w:lsdException w:name="List Continue 5" w:semiHidden="1" w:unhideWhenUsed="1"/>
+    <w:lsdException w:name="Message Header" w:semiHidden="1" w:unhideWhenUsed="1"/>
+    <w:lsdException w:name="Subtitle" w:uiPriority="11" w:qFormat="1"/>
+    <w:lsdException w:name="Salutation" w:semiHidden="1" w:unhideWhenUsed="1"/>
+    <w:lsdException w:name="Date" w:semiHidden="1" w:unhideWhenUsed="1"/>
+    <w:lsdException w:name="Body Text First Indent" w:semiHidden="1" w:unhideWhenUsed="1"/>
+    <w:lsdException w:name="Body Text First Indent 2" w:semiHidden="1" w:unhideWhenUsed="1"/>
+    <w:lsdException w:name="Note Heading" w:semiHidden="1" w:unhideWhenUsed="1"/>
+    <w:lsdException w:name="Body Text 2" w:semiHidden="1" w:unhideWhenUsed="1"/>
+    <w:lsdException w:name="Body Text 3" w:semiHidden="1" w:unhideWhenUsed="1"/>
+    <w:lsdException w:name="Body Text Indent 2" w:semiHidden="1" w:unhideWhenUsed="1"/>
+    <w:lsdException w:name="Body Text Indent 3" w:semiHidden="1" w:unhideWhenUsed="1"/>
+    <w:lsdException w:name="Block Text" w:semiHidden="1" w:unhideWhenUsed="1"/>
+    <w:lsdException w:name="Hyperlink" w:semiHidden="1" w:unhideWhenUsed="1"/>
+    <w:lsdException w:name="FollowedHyperlink" w:semiHidden="1" w:unhideWhenUsed="1"/>
+    <w:lsdException w:name="Strong" w:uiPriority="22" w:qFormat="1"/>
+    <w:lsdException w:name="Emphasis" w:uiPriority="20" w:qFormat="1"/>
+    <w:lsdException w:name="Document Map" w:semiHidden="1" w:unhideWhenUsed="1"/>
+    <w:lsdException w:name="Plain Text" w:semiHidden="1" w:unhideWhenUsed="1"/>
+    <w:lsdException w:name="E-mail Signature" w:semiHidden="1" w:unhideWhenUsed="1"/>
+    <w:lsdException w:name="HTML Top of Form" w:semiHidden="1" w:unhideWhenUsed="1"/>
+    <w:lsdException w:name="HTML Bottom of Form" w:semiHidden="1" w:unhideWhenUsed="1"/>
+    <w:lsdException w:name="Normal (Web)" w:semiHidden="1" w:unhideWhenUsed="1"/>
+    <w:lsdException w:name="HTML Acronym" w:semiHidden="1" w:unhideWhenUsed="1"/>
+    <w:lsdException w:name="HTML Address" w:semiHidden="1" w:unhideWhenUsed="1"/>
+    <w:lsdException w:name="HTML Cite" w:semiHidden="1" w:unhideWhenUsed="1"/>
+    <w:lsdException w:name="HTML Code" w:semiHidden="1" w:unhideWhenUsed="1"/>
+    <w:lsdException w:name="HTML Definition" w:semiHidden="1" w:unhideWhenUsed="1"/>
+    <w:lsdException w:name="HTML Keyboard" w:semiHidden="1" w:unhideWhenUsed="1"/>
+    <w:lsdException w:name="HTML Preformatted" w:semiHidden="1" w:unhideWhenUsed="1"/>
+    <w:lsdException w:name="HTML Sample" w:semiHidden="1" w:unhideWhenUsed="1"/>
+    <w:lsdException w:name="HTML Typewriter" w:semiHidden="1" w:unhideWhenUsed="1"/>
+    <w:lsdException w:name="HTML Variable" w:semiHidden="1" w:unhideWhenUsed="1"/>
+    <w:lsdException w:name="Normal Table" w:semiHidden="1" w:unhideWhenUsed="1"/>
+    <w:lsdException w:name="annotation subject" w:semiHidden="1" w:unhideWhenUsed="1"/>
+    <w:lsdException w:name="No List" w:semiHidden="1" w:unhideWhenUsed="1"/>
+    <w:lsdException w:name="Outline List 1" w:semiHidden="1" w:unhideWhenUsed="1"/>
+    <w:lsdException w:name="Outline List 2" w:semiHidden="1" w:unhideWhenUsed="1"/>
+    <w:lsdException w:name="Outline List 3" w:semiHidden="1" w:unhideWhenUsed="1"/>
+    <w:lsdException w:name="Table Simple 1" w:semiHidden="1" w:unhideWhenUsed="1"/>
+    <w:lsdException w:name="Table Simple 2" w:semiHidden="1" w:unhideWhenUsed="1"/>
+    <w:lsdException w:name="Table Simple 3" w:semiHidden="1" w:unhideWhenUsed="1"/>
+    <w:lsdException w:name="Table Classic 1" w:semiHidden="1" w:unhideWhenUsed="1"/>
+    <w:lsdException w:name="Table Classic 2" w:semiHidden="1" w:unhideWhenUsed="1"/>
+    <w:lsdException w:name="Table Classic 3" w:semiHidden="1" w:unhideWhenUsed="1"/>
+    <w:lsdException w:name="Table Classic 4" w:semiHidden="1" w:unhideWhenUsed="1"/>
+    <w:lsdException w:name="Table Colorful 1" w:semiHidden="1" w:unhideWhenUsed="1"/>
+    <w:lsdException w:name="Table Colorful 2" w:semiHidden="1" w:unhideWhenUsed="1"/>
+    <w:lsdException w:name="Table Colorful 3" w:semiHidden="1" w:unhideWhenUsed="1"/>
+    <w:lsdException w:name="Table Columns 1" w:semiHidden="1" w:unhideWhenUsed="1"/>
+    <w:lsdException w:name="Table Columns 2" w:semiHidden="1" w:unhideWhenUsed="1"/>
+    <w:lsdException w:name="Table Columns 3" w:semiHidden="1" w:unhideWhenUsed="1"/>
+    <w:lsdException w:name="Table Columns 4" w:semiHidden="1" w:unhideWhenUsed="1"/>
+    <w:lsdException w:name="Table Columns 5" w:semiHidden="1" w:unhideWhenUsed="1"/>
+    <w:lsdException w:name="Table Grid 1" w:semiHidden="1" w:unhideWhenUsed="1"/>
+    <w:lsdException w:name="Table Grid 2" w:semiHidden="1" w:unhideWhenUsed="1"/>
+    <w:lsdException w:name="Table Grid 3" w:semiHidden="1" w:unhideWhenUsed="1"/>
+    <w:lsdException w:name="Table Grid 4" w:semiHidden="1" w:unhideWhenUsed="1"/>
+    <w:lsdException w:name="Table Grid 5" w:semiHidden="1" w:unhideWhenUsed="1"/>
+    <w:lsdException w:name="Table Grid 6" w:semiHidden="1" w:unhideWhenUsed="1"/>
+    <w:lsdException w:name="Table Grid 7" w:semiHidden="1" w:unhideWhenUsed="1"/>
+    <w:lsdException w:name="Table Grid 8" w:semiHidden="1" w:unhideWhenUsed="1"/>
+    <w:lsdException w:name="Table List 1" w:semiHidden="1" w:unhideWhenUsed="1"/>
+    <w:lsdException w:name="Table List 2" w:semiHidden="1" w:unhideWhenUsed="1"/>
+    <w:lsdException w:name="Table List 3" w:semiHidden="1" w:unhideWhenUsed="1"/>
+    <w:lsdException w:name="Table List 4" w:semiHidden="1" w:unhideWhenUsed="1"/>
+    <w:lsdException w:name="Table List 5" w:semiHidden="1" w:unhideWhenUsed="1"/>
+    <w:lsdException w:name="Table List 6" w:semiHidden="1" w:unhideWhenUsed="1"/>
+    <w:lsdException w:name="Table List 7" w:semiHidden="1" w:unhideWhenUsed="1"/>
+    <w:lsdException w:name="Table List 8" w:semiHidden="1" w:unhideWhenUsed="1"/>
+    <w:lsdException w:name="Table 3D effects 1" w:semiHidden="1" w:unhideWhenUsed="1"/>
+    <w:lsdException w:name="Table 3D effects 2" w:semiHidden="1" w:unhideWhenUsed="1"/>
+    <w:lsdException w:name="Table 3D effects 3" w:semiHidden="1" w:unhideWhenUsed="1"/>
+    <w:lsdException w:name="Table Contemporary" w:semiHidden="1" w:unhideWhenUsed="1"/>
+    <w:lsdException w:name="Table Elegant" w:semiHidden="1" w:unhideWhenUsed="1"/>
+    <w:lsdException w:name="Table Professional" w:semiHidden="1" w:unhideWhenUsed="1"/>
+    <w:lsdException w:name="Table Subtle 1" w:semiHidden="1" w:unhideWhenUsed="1"/>
+    <w:lsdException w:name="Table Subtle 2" w:semiHidden="1" w:unhideWhenUsed="1"/>
+    <w:lsdException w:name="Table Web 1" w:semiHidden="1" w:unhideWhenUsed="1"/>
+    <w:lsdException w:name="Table Web 2" w:semiHidden="1" w:unhideWhenUsed="1"/>
+    <w:lsdException w:name="Table Web 3" w:semiHidden="1" w:unhideWhenUsed="1"/>
+    <w:lsdException w:name="Balloon Text" w:semiHidden="1" w:unhideWhenUsed="1"/>
+    <w:lsdException w:name="Table Grid" w:uiPriority="39"/>
+    <w:lsdException w:name="Table Theme" w:semiHidden="1" w:unhideWhenUsed="1"/>
+    <w:lsdException w:name="Placeholder Text" w:semiHidden="1"/>
+    <w:lsdException w:name="No Spacing" w:uiPriority="1" w:qFormat="1"/>
+    <w:lsdException w:name="Light Shading" w:uiPriority="60"/>
+    <w:lsdException w:name="Light List" w:uiPriority="61"/>
+    <w:lsdException w:name="Light Grid" w:uiPriority="62"/>
+    <w:lsdException w:name="Medium Shading 1" w:uiPriority="63"/>
+    <w:lsdException w:name="Medium Shading 2" w:uiPriority="64"/>
+    <w:lsdException w:name="Medium List 1" w:uiPriority="65"/>
+    <w:lsdException w:name="Medium List 2" w:uiPriority="66"/>
+    <w:lsdException w:name="Medium Grid 1" w:uiPriority="67"/>
+    <w:lsdException w:name="Medium Grid 2" w:uiPriority="68"/>
+    <w:lsdException w:name="Medium Grid 3" w:uiPriority="69"/>
+    <w:lsdException w:name="Dark List" w:uiPriority="70"/>
+    <w:lsdException w:name="Colorful Shading" w:uiPriority="71"/>
+    <w:lsdException w:name="Colorful List" w:uiPriority="72"/>
+    <w:lsdException w:name="Colorful Grid" w:uiPriority="73"/>
+    <w:lsdException w:name="Light Shading Accent 1" w:uiPriority="60"/>
+    <w:lsdException w:name="Light List Accent 1" w:uiPriority="61"/>
+    <w:lsdException w:name="Light Grid Accent 1" w:uiPriority="62"/>
+    <w:lsdException w:name="Medium Shading 1 Accent 1" w:uiPriority="63"/>
+    <w:lsdException w:name="Medium Shading 2 Accent 1" w:uiPriority="64"/>
+    <w:lsdException w:name="Medium List 1 Accent 1" w:uiPriority="65"/>
+    <w:lsdException w:name="Revision" w:semiHidden="1"/>
+    <w:lsdException w:name="List Paragraph" w:uiPriority="34" w:qFormat="1"/>
+    <w:lsdException w:name="Quote" w:uiPriority="29" w:qFormat="1"/>
+    <w:lsdException w:name="Intense Quote" w:uiPriority="30" w:qFormat="1"/>
+    <w:lsdException w:name="Medium List 2 Accent 1" w:uiPriority="66"/>
+    <w:lsdException w:name="Medium Grid 1 Accent 1" w:uiPriority="67"/>
+    <w:lsdException w:name="Medium Grid 2 Accent 1" w:uiPriority="68"/>
+    <w:lsdException w:name="Medium Grid 3 Accent 1" w:uiPriority="69"/>
+    <w:lsdException w:name="Dark List Accent 1" w:uiPriority="70"/>
+    <w:lsdException w:name="Colorful Shading Accent 1" w:uiPriority="71"/>
+    <w:lsdException w:name="Colorful List Accent 1" w:uiPriority="72"/>
+    <w:lsdException w:name="Colorful Grid Accent 1" w:uiPriority="73"/>
+    <w:lsdException w:name="Light Shading Accent 2" w:uiPriority="60"/>
+    <w:lsdException w:name="Light List Accent 2" w:uiPriority="61"/>
+    <w:lsdException w:name="Light Grid Accent 2" w:uiPriority="62"/>
+    <w:lsdException w:name="Medium Shading 1 Accent 2" w:uiPriority="63"/>
+    <w:lsdException w:name="Medium Shading 2 Accent 2" w:uiPriority="64"/>
+    <w:lsdException w:name="Medium List 1 Accent 2" w:uiPriority="65"/>
+    <w:lsdException w:name="Medium List 2 Accent 2" w:uiPriority="66"/>
+    <w:lsdException w:name="Medium Grid 1 Accent 2" w:uiPriority="67"/>
+    <w:lsdException w:name="Medium Grid 2 Accent 2" w:uiPriority="68"/>
+    <w:lsdException w:name="Medium Grid 3 Accent 2" w:uiPriority="69"/>
+    <w:lsdException w:name="Dark List Accent 2" w:uiPriority="70"/>
+    <w:lsdException w:name="Colorful Shading Accent 2" w:uiPriority="71"/>
+    <w:lsdException w:name="Colorful List Accent 2" w:uiPriority="72"/>
+    <w:lsdException w:name="Colorful Grid Accent 2" w:uiPriority="73"/>
+    <w:lsdException w:name="Light Shading Accent 3" w:uiPriority="60"/>
+    <w:lsdException w:name="Light List Accent 3" w:uiPriority="61"/>
+    <w:lsdException w:name="Light Grid Accent 3" w:uiPriority="62"/>
+    <w:lsdException w:name="Medium Shading 1 Accent 3" w:uiPriority="63"/>
+    <w:lsdException w:name="Medium Shading 2 Accent 3" w:uiPriority="64"/>
+    <w:lsdException w:name="Medium List 1 Accent 3" w:uiPriority="65"/>
+    <w:lsdException w:name="Medium List 2 Accent 3" w:uiPriority="66"/>
+    <w:lsdException w:name="Medium Grid 1 Accent 3" w:uiPriority="67"/>
+    <w:lsdException w:name="Medium Grid 2 Accent 3" w:uiPriority="68"/>
+    <w:lsdException w:name="Medium Grid 3 Accent 3" w:uiPriority="69"/>
+    <w:lsdException w:name="Dark List Accent 3" w:uiPriority="70"/>
+    <w:lsdException w:name="Colorful Shading Accent 3" w:uiPriority="71"/>
+    <w:lsdException w:name="Colorful List Accent 3" w:uiPriority="72"/>
+    <w:lsdException w:name="Colorful Grid Accent 3" w:uiPriority="73"/>
+    <w:lsdException w:name="Light Shading Accent 4" w:uiPriority="60"/>
+    <w:lsdException w:name="Light List Accent 4" w:uiPriority="61"/>
+    <w:lsdException w:name="Light Grid Accent 4" w:uiPriority="62"/>
+    <w:lsdException w:name="Medium Shading 1 Accent 4" w:uiPriority="63"/>
+    <w:lsdException w:name="Medium Shading 2 Accent 4" w:uiPriority="64"/>
+    <w:lsdException w:name="Medium List 1 Accent 4" w:uiPriority="65"/>
+    <w:lsdException w:name="Medium List 2 Accent 4" w:uiPriority="66"/>
+    <w:lsdException w:name="Medium Grid 1 Accent 4" w:uiPriority="67"/>
+    <w:lsdException w:name="Medium Grid 2 Accent 4" w:uiPriority="68"/>
+    <w:lsdException w:name="Medium Grid 3 Accent 4" w:uiPriority="69"/>
+    <w:lsdException w:name="Dark List Accent 4" w:uiPriority="70"/>
+    <w:lsdException w:name="Colorful Shading Accent 4" w:uiPriority="71"/>
+    <w:lsdException w:name="Colorful List Accent 4" w:uiPriority="72"/>
+    <w:lsdException w:name="Colorful Grid Accent 4" w:uiPriority="73"/>
+    <w:lsdException w:name="Light Shading Accent 5" w:uiPriority="60"/>
+    <w:lsdException w:name="Light List Accent 5" w:uiPriority="61"/>
+    <w:lsdException w:name="Light Grid Accent 5" w:uiPriority="62"/>
+    <w:lsdException w:name="Medium Shading 1 Accent 5" w:uiPriority="63"/>
+    <w:lsdException w:name="Medium Shading 2 Accent 5" w:uiPriority="64"/>
+    <w:lsdException w:name="Medium List 1 Accent 5" w:uiPriority="65"/>
+    <w:lsdException w:name="Medium List 2 Accent 5" w:uiPriority="66"/>
+    <w:lsdException w:name="Medium Grid 1 Accent 5" w:uiPriority="67"/>
+    <w:lsdException w:name="Medium Grid 2 Accent 5" w:uiPriority="68"/>
+    <w:lsdException w:name="Medium Grid 3 Accent 5" w:uiPriority="69"/>
+    <w:lsdException w:name="Dark List Accent 5" w:uiPriority="70"/>
+    <w:lsdException w:name="Colorful Shading Accent 5" w:uiPriority="71"/>
+    <w:lsdException w:name="Colorful List Accent 5" w:uiPriority="72"/>
+    <w:lsdException w:name="Colorful Grid Accent 5" w:uiPriority="73"/>
+    <w:lsdException w:name="Light Shading Accent 6" w:uiPriority="60"/>
+    <w:lsdException w:name="Light List Accent 6" w:uiPriority="61"/>
+    <w:lsdException w:name="Light Grid Accent 6" w:uiPriority="62"/>
+    <w:lsdException w:name="Medium Shading 1 Accent 6" w:uiPriority="63"/>
+    <w:lsdException w:name="Medium Shading 2 Accent 6" w:uiPriority="64"/>
+    <w:lsdException w:name="Medium List 1 Accent 6" w:uiPriority="65"/>
+    <w:lsdException w:name="Medium List 2 Accent 6" w:uiPriority="66"/>
+    <w:lsdException w:name="Medium Grid 1 Accent 6" w:uiPriority="67"/>
+    <w:lsdException w:name="Medium Grid 2 Accent 6" w:uiPriority="68"/>
+    <w:lsdException w:name="Medium Grid 3 Accent 6" w:uiPriority="69"/>
+    <w:lsdException w:name="Dark List Accent 6" w:uiPriority="70"/>
+    <w:lsdException w:name="Colorful Shading Accent 6" w:uiPriority="71"/>
+    <w:lsdException w:name="Colorful List Accent 6" w:uiPriority="72"/>
+    <w:lsdException w:name="Colorful Grid Accent 6" w:uiPriority="73"/>
+    <w:lsdException w:name="Subtle Emphasis" w:uiPriority="19" w:qFormat="1"/>
+    <w:lsdException w:name="Intense Emphasis" w:uiPriority="21" w:qFormat="1"/>
+    <w:lsdException w:name="Subtle Reference" w:uiPriority="31" w:qFormat="1"/>
+    <w:lsdException w:name="Intense Reference" w:uiPriority="32" w:qFormat="1"/>
+    <w:lsdException w:name="Book Title" w:uiPriority="33" w:qFormat="1"/>
+    <w:lsdException w:name="Bibliography" w:semiHidden="1" w:uiPriority="37" w:unhideWhenUsed="1"/>
+    <w:lsdException w:name="TOC Heading" w:semiHidden="1" w:uiPriority="39" w:unhideWhenUsed="1" w:qFormat="1"/>
+    <w:lsdException w:name="Plain Table 1" w:uiPriority="41"/>
+    <w:lsdException w:name="Plain Table 2" w:uiPriority="42"/>
+    <w:lsdException w:name="Plain Table 3" w:uiPriority="43"/>
+    <w:lsdException w:name="Plain Table 4" w:uiPriority="44"/>
+    <w:lsdException w:name="Plain Table 5" w:uiPriority="45"/>
+    <w:lsdException w:name="Grid Table Light" w:uiPriority="40"/>
+    <w:lsdException w:name="Grid Table 1 Light" w:uiPriority="46"/>
+    <w:lsdException w:name="Grid Table 2" w:uiPriority="47"/>
+    <w:lsdException w:name="Grid Table 3" w:uiPriority="48"/>
+    <w:lsdException w:name="Grid Table 4" w:uiPriority="49"/>
+    <w:lsdException w:name="Grid Table 5 Dark" w:uiPriority="50"/>
+    <w:lsdException w:name="Grid Table 6 Colorful" w:uiPriority="51"/>
+    <w:lsdException w:name="Grid Table 7 Colorful" w:uiPriority="52"/>
+    <w:lsdException w:name="Grid Table 1 Light Accent 1" w:uiPriority="46"/>
+    <w:lsdException w:name="Grid Table 2 Accent 1" w:uiPriority="47"/>
+    <w:lsdException w:name="Grid Table 3 Accent 1" w:uiPriority="48"/>
+    <w:lsdException w:name="Grid Table 4 Accent 1" w:uiPriority="49"/>
+    <w:lsdException w:name="Grid Table 5 Dark Accent 1" w:uiPriority="50"/>
+    <w:lsdException w:name="Grid Table 6 Colorful Accent 1" w:uiPriority="51"/>
+    <w:lsdException w:name="Grid Table 7 Colorful Accent 1" w:uiPriority="52"/>
+    <w:lsdException w:name="Grid Table 1 Light Accent 2" w:uiPriority="46"/>
+    <w:lsdException w:name="Grid Table 2 Accent 2" w:uiPriority="47"/>
+    <w:lsdException w:name="Grid Table 3 Accent 2" w:uiPriority="48"/>
+    <w:lsdException w:name="Grid Table 4 Accent 2" w:uiPriority="49"/>
+    <w:lsdException w:name="Grid Table 5 Dark Accent 2" w:uiPriority="50"/>
+    <w:lsdException w:name="Grid Table 6 Colorful Accent 2" w:uiPriority="51"/>
+    <w:lsdException w:name="Grid Table 7 Colorful Accent 2" w:uiPriority="52"/>
+    <w:lsdException w:name="Grid Table 1 Light Accent 3" w:uiPriority="46"/>
+    <w:lsdException w:name="Grid Table 2 Accent 3" w:uiPriority="47"/>
+    <w:lsdException w:name="Grid Table 3 Accent 3" w:uiPriority="48"/>
+    <w:lsdException w:name="Grid Table 4 Accent 3" w:uiPriority="49"/>
+    <w:lsdException w:name="Grid Table 5 Dark Accent 3" w:uiPriority="50"/>
+    <w:lsdException w:name="Grid Table 6 Colorful Accent 3" w:uiPriority="51"/>
+    <w:lsdException w:name="Grid Table 7 Colorful Accent 3" w:uiPriority="52"/>
+    <w:lsdException w:name="Grid Table 1 Light Accent 4" w:uiPriority="46"/>
+    <w:lsdException w:name="Grid Table 2 Accent 4" w:uiPriority="47"/>
+    <w:lsdException w:name="Grid Table 3 Accent 4" w:uiPriority="48"/>
+    <w:lsdException w:name="Grid Table 4 Accent 4" w:uiPriority="49"/>
+    <w:lsdException w:name="Grid Table 5 Dark Accent 4" w:uiPriority="50"/>
+    <w:lsdException w:name="Grid Table 6 Colorful Accent 4" w:uiPriority="51"/>
+    <w:lsdException w:name="Grid Table 7 Colorful Accent 4" w:uiPriority="52"/>
+    <w:lsdException w:name="Grid Table 1 Light Accent 5" w:uiPriority="46"/>
+    <w:lsdException w:name="Grid Table 2 Accent 5" w:uiPriority="47"/>
+    <w:lsdException w:name="Grid Table 3 Accent 5" w:uiPriority="48"/>
+    <w:lsdException w:name="Grid Table 4 Accent 5" w:uiPriority="49"/>
+    <w:lsdException w:name="Grid Table 5 Dark Accent 5" w:uiPriority="50"/>
+    <w:lsdException w:name="Grid Table 6 Colorful Accent 5" w:uiPriority="51"/>
+    <w:lsdException w:name="Grid Table 7 Colorful Accent 5" w:uiPriority="52"/>
+    <w:lsdException w:name="Grid Table 1 Light Accent 6" w:uiPriority="46"/>
+    <w:lsdException w:name="Grid Table 2 Accent 6" w:uiPriority="47"/>
+    <w:lsdException w:name="Grid Table 3 Accent 6" w:uiPriority="48"/>
+    <w:lsdException w:name="Grid Table 4 Accent 6" w:uiPriority="49"/>
+    <w:lsdException w:name="Grid Table 5 Dark Accent 6" w:uiPriority="50"/>
+    <w:lsdException w:name="Grid Table 6 Colorful Accent 6" w:uiPriority="51"/>
+    <w:lsdException w:name="Grid Table 7 Colorful Accent 6" w:uiPriority="52"/>
+    <w:lsdException w:name="List Table 1 Light" w:uiPriority="46"/>
+    <w:lsdException w:name="List Table 2" w:uiPriority="47"/>
+    <w:lsdException w:name="List Table 3" w:uiPriority="48"/>
+    <w:lsdException w:name="List Table 4" w:uiPriority="49"/>
+    <w:lsdException w:name="List Table 5 Dark" w:uiPriority="50"/>
+    <w:lsdException w:name="List Table 6 Colorful" w:uiPriority="51"/>
+    <w:lsdException w:name="List Table 7 Colorful" w:uiPriority="52"/>
+    <w:lsdException w:name="List Table 1 Light Accent 1" w:uiPriority="46"/>
+    <w:lsdException w:name="List Table 2 Accent 1" w:uiPriority="47"/>
+    <w:lsdException w:name="List Table 3 Accent 1" w:uiPriority="48"/>
+    <w:lsdException w:name="List Table 4 Accent 1" w:uiPriority="49"/>
+    <w:lsdException w:name="List Table 5 Dark Accent 1" w:uiPriority="50"/>
+    <w:lsdException w:name="List Table 6 Colorful Accent 1" w:uiPriority="51"/>
+    <w:lsdException w:name="List Table 7 Colorful Accent 1" w:uiPriority="52"/>
+    <w:lsdException w:name="List Table 1 Light Accent 2" w:uiPriority="46"/>
+    <w:lsdException w:name="List Table 2 Accent 2" w:uiPriority="47"/>
+    <w:lsdException w:name="List Table 3 Accent 2" w:uiPriority="48"/>
+    <w:lsdException w:name="List Table 4 Accent 2" w:uiPriority="49"/>
+    <w:lsdException w:name="List Table 5 Dark Accent 2" w:uiPriority="50"/>
+    <w:lsdException w:name="List Table 6 Colorful Accent 2" w:uiPriority="51"/>
+    <w:lsdException w:name="List Table 7 Colorful Accent 2" w:uiPriority="52"/>
+    <w:lsdException w:name="List Table 1 Light Accent 3" w:uiPriority="46"/>
+    <w:lsdException w:name="List Table 2 Accent 3" w:uiPriority="47"/>
+    <w:lsdException w:name="List Table 3 Accent 3" w:uiPriority="48"/>
+    <w:lsdException w:name="List Table 4 Accent 3" w:uiPriority="49"/>
+    <w:lsdException w:name="List Table 5 Dark Accent 3" w:uiPriority="50"/>
+    <w:lsdException w:name="List Table 6 Colorful Accent 3" w:uiPriority="51"/>
+    <w:lsdException w:name="List Table 7 Colorful Accent 3" w:uiPriority="52"/>
+    <w:lsdException w:name="List Table 1 Light Accent 4" w:uiPriority="46"/>
+    <w:lsdException w:name="List Table 2 Accent 4" w:uiPriority="47"/>
+    <w:lsdException w:name="List Table 3 Accent 4" w:uiPriority="48"/>
+    <w:lsdException w:name="List Table 4 Accent 4" w:uiPriority="49"/>
+    <w:lsdException w:name="List Table 5 Dark Accent 4" w:uiPriority="50"/>
+    <w:lsdException w:name="List Table 6 Colorful Accent 4" w:uiPriority="51"/>
+    <w:lsdException w:name="List Table 7 Colorful Accent 4" w:uiPriority="52"/>
+    <w:lsdException w:name="List Table 1 Light Accent 5" w:uiPriority="46"/>
+    <w:lsdException w:name="List Table 2 Accent 5" w:uiPriority="47"/>
+    <w:lsdException w:name="List Table 3 Accent 5" w:uiPriority="48"/>
+    <w:lsdException w:name="List Table 4 Accent 5" w:uiPriority="49"/>
+    <w:lsdException w:name="List Table 5 Dark Accent 5" w:uiPriority="50"/>
+    <w:lsdException w:name="List Table 6 Colorful Accent 5" w:uiPriority="51"/>
+    <w:lsdException w:name="List Table 7 Colorful Accent 5" w:uiPriority="52"/>
+    <w:lsdException w:name="List Table 1 Light Accent 6" w:uiPriority="46"/>
+    <w:lsdException w:name="List Table 2 Accent 6" w:uiPriority="47"/>
+    <w:lsdException w:name="List Table 3 Accent 6" w:uiPriority="48"/>
+    <w:lsdException w:name="List Table 4 Accent 6" w:uiPriority="49"/>
+    <w:lsdException w:name="List Table 5 Dark Accent 6" w:uiPriority="50"/>
+    <w:lsdException w:name="List Table 6 Colorful Accent 6" w:uiPriority="51"/>
+    <w:lsdException w:name="List Table 7 Colorful Accent 6" w:uiPriority="52"/>
+  </w:latentStyles>
+  <w:style w:type="paragraph" w:default="1" w:styleId="a">
+    <w:name w:val="Normal"/>
+    <w:qFormat/>
+    <w:pPr>
+      <w:widowControl w:val="0"/>
+      <w:wordWrap w:val="0"/>
+      <w:autoSpaceDE w:val="0"/>
+      <w:autoSpaceDN w:val="0"/>
+    </w:pPr>
+  </w:style>
+  <w:style w:type="character" w:default="1" w:styleId="a0">
+    <w:name w:val="Default Paragraph Font"/>
+    <w:uiPriority w:val="1"/>
+    <w:semiHidden/>
+    <w:unhideWhenUsed/>
+  </w:style>
+  <w:style w:type="table" w:default="1" w:styleId="a1">
+    <w:name w:val="Normal Table"/>
+    <w:uiPriority w:val="99"/>
+    <w:semiHidden/>
+    <w:unhideWhenUsed/>
+    <w:tblPr>
+      <w:tblInd w:w="0" w:type="dxa"/>
+      <w:tblCellMar>
+        <w:top w:w="0" w:type="dxa"/>
+        <w:left w:w="108" w:type="dxa"/>
+        <w:bottom w:w="0" w:type="dxa"/>
+        <w:right w:w="108" w:type="dxa"/>
+      </w:tblCellMar>
+    </w:tblPr>
+  </w:style>
+  <w:style w:type="numbering" w:default="1" w:styleId="a2">
+    <w:name w:val="No List"/>
+    <w:uiPriority w:val="99"/>
+    <w:semiHidden/>
+    <w:unhideWhenUsed/>
+  </w:style>
+  <w:style w:type="paragraph" w:customStyle="1" w:styleId="21FC848881934AA1AA5547363B463347">
+    <w:name w:val="21FC848881934AA1AA5547363B463347"/>
+    <w:rsid w:val="00747AAF"/>
+    <w:pPr>
+      <w:widowControl w:val="0"/>
+      <w:wordWrap w:val="0"/>
+      <w:autoSpaceDE w:val="0"/>
+      <w:autoSpaceDN w:val="0"/>
+    </w:pPr>
+  </w:style>
+  <w:style w:type="paragraph" w:customStyle="1" w:styleId="308C3C94EDA9433B9453518D4E468504">
+    <w:name w:val="308C3C94EDA9433B9453518D4E468504"/>
+    <w:rsid w:val="00747AAF"/>
+    <w:pPr>
+      <w:widowControl w:val="0"/>
+      <w:wordWrap w:val="0"/>
+      <w:autoSpaceDE w:val="0"/>
+      <w:autoSpaceDN w:val="0"/>
+    </w:pPr>
+  </w:style>
+  <w:style w:type="paragraph" w:customStyle="1" w:styleId="2992C1C8CCD84F0B88FEDC81283D104E">
+    <w:name w:val="2992C1C8CCD84F0B88FEDC81283D104E"/>
+    <w:rsid w:val="00747AAF"/>
+    <w:pPr>
+      <w:widowControl w:val="0"/>
+      <w:wordWrap w:val="0"/>
+      <w:autoSpaceDE w:val="0"/>
+      <w:autoSpaceDN w:val="0"/>
+    </w:pPr>
+  </w:style>
+</w:styles>
+</file>
+
+<file path=word/glossary/webSettings.xml><?xml version="1.0" encoding="utf-8"?>
+<w:webSettings xmlns:mc="http://schemas.openxmlformats.org/markup-compatibility/2006" xmlns:r="http://schemas.openxmlformats.org/officeDocument/2006/relationships" xmlns:w="http://schemas.openxmlformats.org/wordprocessingml/2006/main" xmlns:w14="http://schemas.microsoft.com/office/word/2010/wordml" xmlns:w15="http://schemas.microsoft.com/office/word/2012/wordml" xmlns:w16se="http://schemas.microsoft.com/office/word/2015/wordml/symex" mc:Ignorable="w14 w15 w16se">
+  <w:optimizeForBrowser/>
+  <w:allowPNG/>
+</w:webSettings>
 </file>
 
 <file path=word/theme/theme1.xml><?xml version="1.0" encoding="utf-8"?>
@@ -42139,7 +41840,7 @@
 </file>
 
 <file path=customXml/itemProps1.xml><?xml version="1.0" encoding="utf-8"?>
-<ds:datastoreItem xmlns:ds="http://schemas.openxmlformats.org/officeDocument/2006/customXml" ds:itemID="{2AC8307C-4888-41E5-8016-FFCA23252DDC}">
+<ds:datastoreItem xmlns:ds="http://schemas.openxmlformats.org/officeDocument/2006/customXml" ds:itemID="{7F002DE1-176D-474E-9678-8A20341E4C25}">
   <ds:schemaRefs>
     <ds:schemaRef ds:uri="http://schemas.openxmlformats.org/officeDocument/2006/bibliography"/>
   </ds:schemaRefs>

</xml_diff>